<commit_message>
Update Folder and Codes
</commit_message>
<xml_diff>
--- a/Project2/Report/Final Report.docx
+++ b/Project2/Report/Final Report.docx
@@ -29,21 +29,7 @@
         <w:rPr>
           <w:rFonts w:asciiTheme="majorBidi" w:hAnsiTheme="majorBidi" w:cstheme="majorBidi"/>
         </w:rPr>
-        <w:t xml:space="preserve">Data will be obtained from the study database and merged across baseline and one-year follow-up visits to create a longitudinal analytic dataset. For all aims, the primary outcomes will be change in episodic memory and change in cortical thickness, defined as baseline minus year-1 values. Baseline measures of each outcome will be included as covariates in all primary models to account for individual differences </w:t>
-      </w:r>
-      <w:proofErr w:type="gramStart"/>
-      <w:r>
-        <w:rPr>
-          <w:rFonts w:asciiTheme="majorBidi" w:hAnsiTheme="majorBidi" w:cstheme="majorBidi"/>
-        </w:rPr>
-        <w:t>at</w:t>
-      </w:r>
-      <w:proofErr w:type="gramEnd"/>
-      <w:r>
-        <w:rPr>
-          <w:rFonts w:asciiTheme="majorBidi" w:hAnsiTheme="majorBidi" w:cstheme="majorBidi"/>
-        </w:rPr>
-        <w:t xml:space="preserve"> study entry.</w:t>
+        <w:t>Data will be obtained from the study database and merged across baseline and one-year follow-up visits to create a longitudinal analytic dataset. For all aims, the primary outcomes will be change in episodic memory and change in cortical thickness, defined as baseline minus year-1 values. Baseline measures of each outcome will be included as covariates in all primary models to account for individual differences at study entry.</w:t>
       </w:r>
     </w:p>
     <w:p>
@@ -59,19 +45,17 @@
         </w:rPr>
         <w:t xml:space="preserve">The analytic dataset will be derived from the full study dataset by </w:t>
       </w:r>
-      <w:proofErr w:type="gramStart"/>
-      <w:r>
-        <w:rPr>
-          <w:rFonts w:asciiTheme="majorBidi" w:hAnsiTheme="majorBidi" w:cstheme="majorBidi"/>
-        </w:rPr>
-        <w:t>restricting to</w:t>
-      </w:r>
-      <w:proofErr w:type="gramEnd"/>
-      <w:r>
-        <w:rPr>
-          <w:rFonts w:asciiTheme="majorBidi" w:hAnsiTheme="majorBidi" w:cstheme="majorBidi"/>
-        </w:rPr>
-        <w:t xml:space="preserve"> participants with complete data on outcomes, exposures, and covariates required for each analysis. Because complete-case analysis may introduce bias if missingness is not random, we will evaluate differences between the full enrolled sample and the analytic sample using descriptive statistics and appropriate statistical tests to assess the potential impact of missing data on study findings.</w:t>
+      <w:r>
+        <w:rPr>
+          <w:rFonts w:asciiTheme="majorBidi" w:hAnsiTheme="majorBidi" w:cstheme="majorBidi"/>
+        </w:rPr>
+        <w:t>restricting</w:t>
+      </w:r>
+      <w:r>
+        <w:rPr>
+          <w:rFonts w:asciiTheme="majorBidi" w:hAnsiTheme="majorBidi" w:cstheme="majorBidi"/>
+        </w:rPr>
+        <w:t xml:space="preserve"> participants with complete data on outcomes, exposures, and covariates required for each analysis. Because complete-case analysis may introduce bias if missingness is not random, we will evaluate differences between the full enrolled sample and the analytic sample using descriptive statistics and appropriate statistical tests.</w:t>
       </w:r>
     </w:p>
     <w:p>
@@ -85,7 +69,7 @@
         <w:rPr>
           <w:rFonts w:asciiTheme="majorBidi" w:hAnsiTheme="majorBidi" w:cstheme="majorBidi"/>
         </w:rPr>
-        <w:t>Data will be reviewed for completeness, outliers, and distributional assumptions. Inflammatory markers are expected to be right-skewed; however, transformations will be evaluated empirically. Table 1 provides an exploratory summary of the primary exposures and covariates by aim, including variable type and distributional considerations, and will guide model specification and variable handling.</w:t>
+        <w:t>Data will be reviewed for completeness, outliers, and distributional assumptions. Inflammatory markers are expected to be right-skewed; transformations will be evaluated empirically as needed. Table 1 summarizes primary exposures and covariates and will guide model specification.</w:t>
       </w:r>
     </w:p>
     <w:p>
@@ -99,47 +83,35 @@
         <w:rPr>
           <w:rFonts w:asciiTheme="majorBidi" w:hAnsiTheme="majorBidi" w:cstheme="majorBidi"/>
         </w:rPr>
-        <w:t>Preliminary data were available for baseline inflammatory markers and change scores for episodic memory and cortical thickness. Because separate baseline and follow-up outcome values were not available in the preliminary dataset, analyses focused on descriptive summaries, histograms, scatterplots, skewness estimates, and correlations between inflammatory markers and outcome change scores. These analyses were used to estimate plausible ranges of associations between predictors and outcomes, as well as correlations among predictors and outcomes, to inform power assumptions.</w:t>
-      </w:r>
-      <w:r>
-        <w:rPr>
-          <w:rFonts w:asciiTheme="majorBidi" w:hAnsiTheme="majorBidi" w:cstheme="majorBidi"/>
-        </w:rPr>
-        <w:t xml:space="preserve"> </w:t>
-      </w:r>
-      <w:r>
-        <w:rPr>
-          <w:rFonts w:asciiTheme="majorBidi" w:hAnsiTheme="majorBidi" w:cstheme="majorBidi"/>
-        </w:rPr>
-        <w:t xml:space="preserve">Preliminary analyses indicated moderate associations between inflammatory markers and memory outcomes (r ≈ 0.25–0.32) and stronger associations </w:t>
+        <w:t>Preliminary data were used to examine distributions, correlations, and plausible effect sizes. These analyses suggested moderate associations between inflammatory markers and memory outcomes (r ≈ 0.25–0.32) and stronger associations with cortical thickness outcomes (r ≈ 0.60–0.70). Because regression models adjust for covariates and include correlated predictors, conservative partial correlation values were used for power calculations (0.15–0.25 for memory; 0.30–0.50 for cortical thickness).</w:t>
+      </w:r>
+    </w:p>
+    <w:p>
+      <w:pPr>
+        <w:spacing w:line="480" w:lineRule="auto"/>
+        <w:rPr>
+          <w:rFonts w:asciiTheme="majorBidi" w:hAnsiTheme="majorBidi" w:cstheme="majorBidi"/>
+        </w:rPr>
+      </w:pPr>
+      <w:r>
+        <w:rPr>
+          <w:rFonts w:asciiTheme="majorBidi" w:hAnsiTheme="majorBidi" w:cstheme="majorBidi"/>
+        </w:rPr>
+        <w:t xml:space="preserve">Preliminary findings also suggested inverse associations between inflammatory markers and memory decline and potential effect modification across markers, supporting inclusion of </w:t>
       </w:r>
       <w:r>
         <w:rPr>
           <w:rFonts w:asciiTheme="majorBidi" w:hAnsiTheme="majorBidi" w:cstheme="majorBidi"/>
         </w:rPr>
         <w:lastRenderedPageBreak/>
-        <w:t>with cortical thickness outcomes (r ≈ 0.60–0.70). Because regression-based analyses adjust for covariates and multiple predictors, we used conservative partial correlation values when estimating power. Specifically, we assumed partial correlations of 0.15–0.25 for memory outcomes and 0.30–0.50 for cortical thickness outcomes.</w:t>
+        <w:t>interaction terms in Aim 2. These findings informed expected directions of association but were not used directly as effect-size inputs.</w:t>
       </w:r>
     </w:p>
     <w:p>
       <w:pPr>
         <w:spacing w:line="480" w:lineRule="auto"/>
         <w:rPr>
-          <w:rFonts w:asciiTheme="majorBidi" w:hAnsiTheme="majorBidi" w:cstheme="majorBidi"/>
-        </w:rPr>
-      </w:pPr>
-      <w:r>
-        <w:rPr>
-          <w:rFonts w:asciiTheme="majorBidi" w:hAnsiTheme="majorBidi" w:cstheme="majorBidi"/>
-        </w:rPr>
-        <w:t>Preliminary findings suggested inverse associations between inflammatory markers and memory outcomes, with higher MCP-1 levels associated with greater cognitive decline. Variation in these associations across levels of other inflammatory markers suggested potential effect modification, supporting the inclusion of interaction terms in Aim 2. These findings informed expected directions of association but were not used to derive effect sizes for power calculations.</w:t>
-      </w:r>
-    </w:p>
-    <w:p>
-      <w:pPr>
-        <w:spacing w:line="480" w:lineRule="auto"/>
-        <w:rPr>
-          <w:rFonts w:asciiTheme="majorBidi" w:hAnsiTheme="majorBidi" w:cstheme="majorBidi"/>
+          <w:rFonts w:asciiTheme="majorBidi" w:hAnsiTheme="majorBidi"/>
         </w:rPr>
       </w:pPr>
       <w:r>
@@ -150,20 +122,23 @@
         </w:rPr>
         <w:t>Aim 1</w:t>
       </w:r>
-      <w:proofErr w:type="gramStart"/>
       <w:r>
         <w:rPr>
           <w:rFonts w:asciiTheme="majorBidi" w:hAnsiTheme="majorBidi" w:cstheme="majorBidi"/>
           <w:b/>
           <w:bCs/>
         </w:rPr>
-        <w:t xml:space="preserve">: </w:t>
-      </w:r>
-      <w:r>
-        <w:rPr>
-          <w:rFonts w:asciiTheme="majorBidi" w:hAnsiTheme="majorBidi" w:cstheme="majorBidi"/>
+        <w:t>:</w:t>
+      </w:r>
+      <w:r>
+        <w:rPr>
+          <w:rFonts w:ascii="Times New Roman" w:eastAsia="Times New Roman" w:hAnsi="Times New Roman" w:cs="Times New Roman"/>
           <w:b/>
           <w:bCs/>
+          <w:kern w:val="0"/>
+          <w:sz w:val="36"/>
+          <w:szCs w:val="36"/>
+          <w14:ligatures w14:val="none"/>
         </w:rPr>
         <w:t xml:space="preserve"> </w:t>
       </w:r>
@@ -171,14 +146,7 @@
         <w:rPr>
           <w:rFonts w:asciiTheme="majorBidi" w:hAnsiTheme="majorBidi" w:cstheme="majorBidi"/>
         </w:rPr>
-        <w:t>To</w:t>
-      </w:r>
-      <w:proofErr w:type="gramEnd"/>
-      <w:r>
-        <w:rPr>
-          <w:rFonts w:asciiTheme="majorBidi" w:hAnsiTheme="majorBidi" w:cstheme="majorBidi"/>
-        </w:rPr>
-        <w:t xml:space="preserve"> evaluate whether baseline inflammatory markers are associated with change in episodic memory and cortical thickness over one year, we will fit multiple linear regression models with outcome change scores as the dependent variables. Separate models will be fit for each outcome and each inflammatory marker of interest. Each model will include the corresponding baseline outcome, the inflammatory marker of interest, and prespecified covariates.</w:t>
+        <w:t>To evaluate whether baseline inflammatory markers are associated with change in episodic memory and cortical thickness over one year, we will fit multiple linear regression models with outcome change scores as the dependent variables.</w:t>
       </w:r>
     </w:p>
     <w:p>
@@ -192,49 +160,7 @@
         <w:rPr>
           <w:rFonts w:asciiTheme="majorBidi" w:hAnsiTheme="majorBidi" w:cstheme="majorBidi"/>
         </w:rPr>
-        <w:t xml:space="preserve">Primary inflammatory markers will include IL-6, TNF-α, MCP-1, and Eotaxin-1. Additional cytokines from the MSD panel and AD-related inflammatory markers such as beta-2 </w:t>
-      </w:r>
-      <w:proofErr w:type="spellStart"/>
-      <w:r>
-        <w:rPr>
-          <w:rFonts w:asciiTheme="majorBidi" w:hAnsiTheme="majorBidi" w:cstheme="majorBidi"/>
-        </w:rPr>
-        <w:t>microglobulin</w:t>
-      </w:r>
-      <w:proofErr w:type="spellEnd"/>
-      <w:r>
-        <w:rPr>
-          <w:rFonts w:asciiTheme="majorBidi" w:hAnsiTheme="majorBidi" w:cstheme="majorBidi"/>
-        </w:rPr>
-        <w:t xml:space="preserve"> and alpha-1 </w:t>
-      </w:r>
-      <w:proofErr w:type="spellStart"/>
-      <w:r>
-        <w:rPr>
-          <w:rFonts w:asciiTheme="majorBidi" w:hAnsiTheme="majorBidi" w:cstheme="majorBidi"/>
-        </w:rPr>
-        <w:t>antichymotrypsin</w:t>
-      </w:r>
-      <w:proofErr w:type="spellEnd"/>
-      <w:r>
-        <w:rPr>
-          <w:rFonts w:asciiTheme="majorBidi" w:hAnsiTheme="majorBidi" w:cstheme="majorBidi"/>
-        </w:rPr>
-        <w:t xml:space="preserve"> will be considered in </w:t>
-      </w:r>
-      <w:proofErr w:type="gramStart"/>
-      <w:r>
-        <w:rPr>
-          <w:rFonts w:asciiTheme="majorBidi" w:hAnsiTheme="majorBidi" w:cstheme="majorBidi"/>
-        </w:rPr>
-        <w:t>exploratory</w:t>
-      </w:r>
-      <w:proofErr w:type="gramEnd"/>
-      <w:r>
-        <w:rPr>
-          <w:rFonts w:asciiTheme="majorBidi" w:hAnsiTheme="majorBidi" w:cstheme="majorBidi"/>
-        </w:rPr>
-        <w:t xml:space="preserve"> analyses. Covariates will include age, sex, education, diagnostic group, APOE genotype, BMI, hypercholesterolemia, NSAID use, and immune-related health conditions.</w:t>
+        <w:t>Primary inflammatory markers include IL-6, TNF-α, MCP-1, and Eotaxin-1. Additional cytokines and AD-related inflammatory markers will be considered exploratory. Covariates include age, sex, education, diagnostic group, APOE genotype, BMI, hypercholesterolemia, NSAID use, and immune-related conditions.</w:t>
       </w:r>
     </w:p>
     <w:p>
@@ -248,8 +174,7 @@
         <w:rPr>
           <w:rFonts w:asciiTheme="majorBidi" w:hAnsiTheme="majorBidi" w:cstheme="majorBidi"/>
         </w:rPr>
-        <w:lastRenderedPageBreak/>
-        <w:t>The primary parameter of interest for Aim 1 will be the regression coefficient for each inflammatory marker, representing the expected difference in change in memory or cortical thickness per unit increase in the marker, adjusted for baseline outcome and covariates.</w:t>
+        <w:t>The primary hypothesis will be evaluated using an omnibus partial F test of the joint contribution of the four inflammatory markers within each outcome:</w:t>
       </w:r>
     </w:p>
     <w:p>
@@ -259,11 +184,177 @@
           <w:rFonts w:asciiTheme="majorBidi" w:hAnsiTheme="majorBidi" w:cstheme="majorBidi"/>
         </w:rPr>
       </w:pPr>
-      <w:r>
-        <w:rPr>
-          <w:rFonts w:asciiTheme="majorBidi" w:hAnsiTheme="majorBidi" w:cstheme="majorBidi"/>
-        </w:rPr>
-        <w:t>To address multiple testing, inflammatory markers will be evaluated within prespecified families defined by outcome. For each outcome, we will first conduct an omnibus partial F test to assess whether inflammatory markers collectively contribute to the model after adjustment for baseline outcome and covariates. This omnibus test evaluates whether any inflammatory marker is associated with the outcome.</w:t>
+      <m:oMathPara>
+        <m:oMath>
+          <m:sSub>
+            <m:sSubPr>
+              <m:ctrlPr>
+                <w:rPr>
+                  <w:rFonts w:ascii="Cambria Math" w:hAnsi="Cambria Math" w:cstheme="majorBidi"/>
+                </w:rPr>
+              </m:ctrlPr>
+            </m:sSubPr>
+            <m:e>
+              <m:r>
+                <w:rPr>
+                  <w:rFonts w:ascii="Cambria Math" w:hAnsi="Cambria Math" w:cstheme="majorBidi"/>
+                </w:rPr>
+                <m:t>H</m:t>
+              </m:r>
+            </m:e>
+            <m:sub>
+              <m:r>
+                <w:rPr>
+                  <w:rFonts w:ascii="Cambria Math" w:hAnsi="Cambria Math" w:cstheme="majorBidi"/>
+                </w:rPr>
+                <m:t>0</m:t>
+              </m:r>
+            </m:sub>
+          </m:sSub>
+          <m:r>
+            <w:rPr>
+              <w:rFonts w:ascii="Cambria Math" w:hAnsi="Cambria Math" w:cstheme="majorBidi"/>
+            </w:rPr>
+            <m:t>:</m:t>
+          </m:r>
+          <m:sSub>
+            <m:sSubPr>
+              <m:ctrlPr>
+                <w:rPr>
+                  <w:rFonts w:ascii="Cambria Math" w:hAnsi="Cambria Math" w:cstheme="majorBidi"/>
+                </w:rPr>
+              </m:ctrlPr>
+            </m:sSubPr>
+            <m:e>
+              <m:r>
+                <w:rPr>
+                  <w:rFonts w:ascii="Cambria Math" w:hAnsi="Cambria Math" w:cstheme="majorBidi"/>
+                </w:rPr>
+                <m:t>β</m:t>
+              </m:r>
+            </m:e>
+            <m:sub>
+              <m:r>
+                <w:rPr>
+                  <w:rFonts w:ascii="Cambria Math" w:hAnsi="Cambria Math" w:cstheme="majorBidi"/>
+                </w:rPr>
+                <m:t>IL6</m:t>
+              </m:r>
+            </m:sub>
+          </m:sSub>
+          <m:r>
+            <w:rPr>
+              <w:rFonts w:ascii="Cambria Math" w:hAnsi="Cambria Math" w:cstheme="majorBidi"/>
+            </w:rPr>
+            <m:t>=</m:t>
+          </m:r>
+          <m:sSub>
+            <m:sSubPr>
+              <m:ctrlPr>
+                <w:rPr>
+                  <w:rFonts w:ascii="Cambria Math" w:hAnsi="Cambria Math" w:cstheme="majorBidi"/>
+                </w:rPr>
+              </m:ctrlPr>
+            </m:sSubPr>
+            <m:e>
+              <m:r>
+                <w:rPr>
+                  <w:rFonts w:ascii="Cambria Math" w:hAnsi="Cambria Math" w:cstheme="majorBidi"/>
+                </w:rPr>
+                <m:t>β</m:t>
+              </m:r>
+            </m:e>
+            <m:sub>
+              <m:r>
+                <w:rPr>
+                  <w:rFonts w:ascii="Cambria Math" w:hAnsi="Cambria Math" w:cstheme="majorBidi"/>
+                </w:rPr>
+                <m:t>TNF</m:t>
+              </m:r>
+            </m:sub>
+          </m:sSub>
+          <m:r>
+            <w:rPr>
+              <w:rFonts w:ascii="Cambria Math" w:hAnsi="Cambria Math" w:cstheme="majorBidi"/>
+            </w:rPr>
+            <m:t>=</m:t>
+          </m:r>
+          <m:sSub>
+            <m:sSubPr>
+              <m:ctrlPr>
+                <w:rPr>
+                  <w:rFonts w:ascii="Cambria Math" w:hAnsi="Cambria Math" w:cstheme="majorBidi"/>
+                </w:rPr>
+              </m:ctrlPr>
+            </m:sSubPr>
+            <m:e>
+              <m:r>
+                <w:rPr>
+                  <w:rFonts w:ascii="Cambria Math" w:hAnsi="Cambria Math" w:cstheme="majorBidi"/>
+                </w:rPr>
+                <m:t>β</m:t>
+              </m:r>
+            </m:e>
+            <m:sub>
+              <m:r>
+                <w:rPr>
+                  <w:rFonts w:ascii="Cambria Math" w:hAnsi="Cambria Math" w:cstheme="majorBidi"/>
+                </w:rPr>
+                <m:t>MCP1</m:t>
+              </m:r>
+            </m:sub>
+          </m:sSub>
+          <m:r>
+            <w:rPr>
+              <w:rFonts w:ascii="Cambria Math" w:hAnsi="Cambria Math" w:cstheme="majorBidi"/>
+            </w:rPr>
+            <m:t>=</m:t>
+          </m:r>
+          <m:sSub>
+            <m:sSubPr>
+              <m:ctrlPr>
+                <w:rPr>
+                  <w:rFonts w:ascii="Cambria Math" w:hAnsi="Cambria Math" w:cstheme="majorBidi"/>
+                </w:rPr>
+              </m:ctrlPr>
+            </m:sSubPr>
+            <m:e>
+              <m:r>
+                <w:rPr>
+                  <w:rFonts w:ascii="Cambria Math" w:hAnsi="Cambria Math" w:cstheme="majorBidi"/>
+                </w:rPr>
+                <m:t>β</m:t>
+              </m:r>
+            </m:e>
+            <m:sub>
+              <m:r>
+                <w:rPr>
+                  <w:rFonts w:ascii="Cambria Math" w:hAnsi="Cambria Math" w:cstheme="majorBidi"/>
+                </w:rPr>
+                <m:t>Eotaxin</m:t>
+              </m:r>
+            </m:sub>
+          </m:sSub>
+          <m:r>
+            <w:rPr>
+              <w:rFonts w:ascii="Cambria Math" w:hAnsi="Cambria Math" w:cstheme="majorBidi"/>
+            </w:rPr>
+            <m:t>=0</m:t>
+          </m:r>
+          <m:r>
+            <w:rPr>
+              <w:rFonts w:asciiTheme="majorBidi" w:hAnsiTheme="majorBidi" w:cstheme="majorBidi"/>
+              <w:i/>
+            </w:rPr>
+            <w:br/>
+          </m:r>
+        </m:oMath>
+      </m:oMathPara>
+      <w:r>
+        <w:rPr>
+          <w:rFonts w:asciiTheme="majorBidi" w:hAnsiTheme="majorBidi" w:cstheme="majorBidi"/>
+        </w:rPr>
+        <w:t>Analyses will be conducted within outcome-specific families (episodic memory and cortical thickness). For each outcome, an omnibus test will be performed at a two-sided α = 0.05.</w:t>
       </w:r>
     </w:p>
     <w:p>
@@ -277,60 +368,147 @@
         <w:rPr>
           <w:rFonts w:asciiTheme="majorBidi" w:hAnsiTheme="majorBidi" w:cstheme="majorBidi"/>
         </w:rPr>
-        <w:t xml:space="preserve">Only if the omnibus test is statistically significant at a two-sided α = 0.05 will we proceed to marker-specific analyses. For these follow-up tests, a Bonferroni correction will be applied by dividing α by the number of markers tested within the family. This approach provides </w:t>
-      </w:r>
-      <w:proofErr w:type="gramStart"/>
-      <w:r>
-        <w:rPr>
-          <w:rFonts w:asciiTheme="majorBidi" w:hAnsiTheme="majorBidi" w:cstheme="majorBidi"/>
-        </w:rPr>
-        <w:t>a conservative</w:t>
-      </w:r>
-      <w:proofErr w:type="gramEnd"/>
-      <w:r>
-        <w:rPr>
-          <w:rFonts w:asciiTheme="majorBidi" w:hAnsiTheme="majorBidi" w:cstheme="majorBidi"/>
-        </w:rPr>
-        <w:t xml:space="preserve"> control of Type I error while maintaining a structured testing framework.</w:t>
-      </w:r>
-    </w:p>
-    <w:p>
-      <w:pPr>
-        <w:spacing w:line="480" w:lineRule="auto"/>
-        <w:rPr>
-          <w:rFonts w:asciiTheme="majorBidi" w:hAnsiTheme="majorBidi" w:cstheme="majorBidi"/>
-        </w:rPr>
-      </w:pPr>
-      <w:r>
-        <w:rPr>
-          <w:rFonts w:asciiTheme="majorBidi" w:hAnsiTheme="majorBidi" w:cstheme="majorBidi"/>
-        </w:rPr>
-        <w:t>Model assumptions will be assessed through standard residual diagnostics, including evaluation of linearity, homoscedasticity, and influential observations. Results will be reported using regression coefficients and 95% confidence intervals. Interpretation will emphasize the magnitude, direction, and consistency of associations across outcomes and markers rather than relying solely on individual p-values.</w:t>
-      </w:r>
-    </w:p>
-    <w:p>
-      <w:pPr>
-        <w:spacing w:line="480" w:lineRule="auto"/>
-        <w:rPr>
-          <w:rFonts w:asciiTheme="majorBidi" w:hAnsiTheme="majorBidi" w:cstheme="majorBidi"/>
-        </w:rPr>
-      </w:pPr>
-      <w:r>
+        <w:t>Only if the omnibus test is statistically significant will marker-specific regression coefficients be examined. For these follow-up analyses, a Bonferroni correction will be applied within each outcome-specific family. Specifically, because four markers are tested, the per-test significance level will be:</w:t>
+      </w:r>
+    </w:p>
+    <w:p>
+      <w:pPr>
+        <w:spacing w:after="0" w:line="480" w:lineRule="auto"/>
+        <w:rPr>
+          <w:rFonts w:asciiTheme="majorBidi" w:eastAsiaTheme="minorEastAsia" w:hAnsiTheme="majorBidi" w:cstheme="majorBidi"/>
+        </w:rPr>
+      </w:pPr>
+      <m:oMathPara>
+        <m:oMath>
+          <m:sSub>
+            <m:sSubPr>
+              <m:ctrlPr>
+                <w:rPr>
+                  <w:rFonts w:ascii="Cambria Math" w:hAnsi="Cambria Math" w:cstheme="majorBidi"/>
+                </w:rPr>
+              </m:ctrlPr>
+            </m:sSubPr>
+            <m:e>
+              <m:r>
+                <w:rPr>
+                  <w:rFonts w:ascii="Cambria Math" w:hAnsi="Cambria Math" w:cstheme="majorBidi"/>
+                </w:rPr>
+                <m:t>α</m:t>
+              </m:r>
+            </m:e>
+            <m:sub>
+              <m:r>
+                <m:rPr>
+                  <m:nor/>
+                </m:rPr>
+                <w:rPr>
+                  <w:rFonts w:asciiTheme="majorBidi" w:hAnsiTheme="majorBidi" w:cstheme="majorBidi"/>
+                </w:rPr>
+                <m:t>per test</m:t>
+              </m:r>
+            </m:sub>
+          </m:sSub>
+          <m:r>
+            <w:rPr>
+              <w:rFonts w:ascii="Cambria Math" w:hAnsi="Cambria Math" w:cstheme="majorBidi"/>
+            </w:rPr>
+            <m:t>=</m:t>
+          </m:r>
+          <m:f>
+            <m:fPr>
+              <m:ctrlPr>
+                <w:rPr>
+                  <w:rFonts w:ascii="Cambria Math" w:hAnsi="Cambria Math" w:cstheme="majorBidi"/>
+                </w:rPr>
+              </m:ctrlPr>
+            </m:fPr>
+            <m:num>
+              <m:r>
+                <w:rPr>
+                  <w:rFonts w:ascii="Cambria Math" w:hAnsi="Cambria Math" w:cstheme="majorBidi"/>
+                </w:rPr>
+                <m:t>0.05</m:t>
+              </m:r>
+            </m:num>
+            <m:den>
+              <m:r>
+                <w:rPr>
+                  <w:rFonts w:ascii="Cambria Math" w:hAnsi="Cambria Math" w:cstheme="majorBidi"/>
+                </w:rPr>
+                <m:t>4</m:t>
+              </m:r>
+            </m:den>
+          </m:f>
+          <m:r>
+            <w:rPr>
+              <w:rFonts w:ascii="Cambria Math" w:hAnsi="Cambria Math" w:cstheme="majorBidi"/>
+            </w:rPr>
+            <m:t>=0.0125</m:t>
+          </m:r>
+        </m:oMath>
+      </m:oMathPara>
+    </w:p>
+    <w:p>
+      <w:pPr>
+        <w:tabs>
+          <w:tab w:val="left" w:pos="5656"/>
+        </w:tabs>
+        <w:spacing w:after="0" w:line="480" w:lineRule="auto"/>
         <w:rPr>
           <w:rFonts w:asciiTheme="majorBidi" w:hAnsiTheme="majorBidi" w:cstheme="majorBidi"/>
           <w:b/>
           <w:bCs/>
         </w:rPr>
-        <w:t>Aim 2</w:t>
-      </w:r>
-      <w:proofErr w:type="gramStart"/>
+      </w:pPr>
+      <w:r>
+        <w:rPr>
+          <w:rFonts w:asciiTheme="majorBidi" w:hAnsiTheme="majorBidi" w:cstheme="majorBidi"/>
+          <w:i/>
+        </w:rPr>
+        <w:br/>
+      </w:r>
+      <w:r>
+        <w:rPr>
+          <w:rFonts w:asciiTheme="majorBidi" w:hAnsiTheme="majorBidi" w:cstheme="majorBidi"/>
+        </w:rPr>
+        <w:t xml:space="preserve">Thus, individual markers will be considered statistically significant only if </w:t>
+      </w:r>
+      <m:oMath>
+        <m:r>
+          <w:rPr>
+            <w:rFonts w:ascii="Cambria Math" w:hAnsi="Cambria Math" w:cstheme="majorBidi"/>
+          </w:rPr>
+          <m:t>p&lt;0.0125</m:t>
+        </m:r>
+      </m:oMath>
+      <w:r>
+        <w:rPr>
+          <w:rFonts w:asciiTheme="majorBidi" w:hAnsiTheme="majorBidi" w:cstheme="majorBidi"/>
+        </w:rPr>
+        <w:t xml:space="preserve">. This </w:t>
+      </w:r>
+      <w:r>
+        <w:rPr>
+          <w:rFonts w:asciiTheme="majorBidi" w:hAnsiTheme="majorBidi" w:cstheme="majorBidi"/>
+        </w:rPr>
+        <w:lastRenderedPageBreak/>
+        <w:t>approach provides conservative control of Type I error while maintaining a structured testing framework.</w:t>
+      </w:r>
+    </w:p>
+    <w:p>
+      <w:pPr>
+        <w:spacing w:line="480" w:lineRule="auto"/>
+        <w:rPr>
+          <w:rFonts w:asciiTheme="majorBidi" w:hAnsiTheme="majorBidi" w:cstheme="majorBidi"/>
+        </w:rPr>
+      </w:pPr>
       <w:r>
         <w:rPr>
           <w:rFonts w:asciiTheme="majorBidi" w:hAnsiTheme="majorBidi" w:cstheme="majorBidi"/>
           <w:b/>
           <w:bCs/>
         </w:rPr>
-        <w:t xml:space="preserve">: </w:t>
+        <w:t xml:space="preserve">Aim 2: </w:t>
       </w:r>
       <w:r>
         <w:rPr>
@@ -344,21 +522,7 @@
         <w:rPr>
           <w:rFonts w:asciiTheme="majorBidi" w:hAnsiTheme="majorBidi" w:cstheme="majorBidi"/>
         </w:rPr>
-        <w:t>To</w:t>
-      </w:r>
-      <w:proofErr w:type="gramEnd"/>
-      <w:r>
-        <w:rPr>
-          <w:rFonts w:asciiTheme="majorBidi" w:hAnsiTheme="majorBidi" w:cstheme="majorBidi"/>
-        </w:rPr>
-        <w:t xml:space="preserve"> evaluate whether inflammation modifies the association between amyloid burden and change in episodic memory and cortical thickness, we will fit multiple linear regression models with outcome change scores as the dependent variables. Each model will include the corresponding baseline outcome, amyloid burden as a main effect, the inflammatory marker as a </w:t>
-      </w:r>
-      <w:r>
-        <w:rPr>
-          <w:rFonts w:asciiTheme="majorBidi" w:hAnsiTheme="majorBidi" w:cstheme="majorBidi"/>
-        </w:rPr>
-        <w:lastRenderedPageBreak/>
-        <w:t>main effect, an amyloid × inflammation interaction term, and the same covariates included in Aim 1.</w:t>
+        <w:t>To evaluate whether inflammation modifies the association between amyloid burden and outcome change, we will fit multiple linear regression models including main effects and interaction terms.</w:t>
       </w:r>
     </w:p>
     <w:p>
@@ -372,7 +536,7 @@
         <w:rPr>
           <w:rFonts w:asciiTheme="majorBidi" w:hAnsiTheme="majorBidi" w:cstheme="majorBidi"/>
         </w:rPr>
-        <w:t>The primary parameter of interest will be the coefficient for the amyloid × inflammation interaction term, which tests whether the association between amyloid burden and outcome change differs across levels of inflammation. Continuous predictors will be centered to facilitate interpretation and reduce nonessential multicollinearity.</w:t>
+        <w:t>Each model will include baseline outcome, amyloid burden, inflammatory markers, amyloid × inflammation interaction terms, and covariates as in Aim 1.</w:t>
       </w:r>
     </w:p>
     <w:p>
@@ -386,7 +550,7 @@
         <w:rPr>
           <w:rFonts w:asciiTheme="majorBidi" w:hAnsiTheme="majorBidi" w:cstheme="majorBidi"/>
         </w:rPr>
-        <w:t>Interaction effects will be evaluated within prespecified families defined by outcome. For each outcome, we will first conduct an omnibus partial F test to assess whether interaction terms collectively contribute to the model beyond main effects and covariates. This test evaluates whether any interaction between amyloid burden and inflammatory markers is present.</w:t>
+        <w:t>The primary hypothesis will be evaluated using an omnibus partial F test of the joint contribution of the four interaction terms:</w:t>
       </w:r>
     </w:p>
     <w:p>
@@ -396,25 +560,177 @@
           <w:rFonts w:asciiTheme="majorBidi" w:hAnsiTheme="majorBidi" w:cstheme="majorBidi"/>
         </w:rPr>
       </w:pPr>
-      <w:r>
-        <w:rPr>
-          <w:rFonts w:asciiTheme="majorBidi" w:hAnsiTheme="majorBidi" w:cstheme="majorBidi"/>
-        </w:rPr>
-        <w:t xml:space="preserve">Only if the omnibus interaction test is statistically significant at a two-sided α = 0.05 will we proceed to marker-specific interaction tests. For these follow-up analyses, a Bonferroni correction will be applied within each family to </w:t>
-      </w:r>
-      <w:proofErr w:type="gramStart"/>
-      <w:r>
-        <w:rPr>
-          <w:rFonts w:asciiTheme="majorBidi" w:hAnsiTheme="majorBidi" w:cstheme="majorBidi"/>
-        </w:rPr>
-        <w:t>control for</w:t>
-      </w:r>
-      <w:proofErr w:type="gramEnd"/>
-      <w:r>
-        <w:rPr>
-          <w:rFonts w:asciiTheme="majorBidi" w:hAnsiTheme="majorBidi" w:cstheme="majorBidi"/>
-        </w:rPr>
-        <w:t xml:space="preserve"> multiple comparisons.</w:t>
+      <m:oMathPara>
+        <m:oMath>
+          <m:sSub>
+            <m:sSubPr>
+              <m:ctrlPr>
+                <w:rPr>
+                  <w:rFonts w:ascii="Cambria Math" w:hAnsi="Cambria Math" w:cstheme="majorBidi"/>
+                </w:rPr>
+              </m:ctrlPr>
+            </m:sSubPr>
+            <m:e>
+              <m:r>
+                <w:rPr>
+                  <w:rFonts w:ascii="Cambria Math" w:hAnsi="Cambria Math" w:cstheme="majorBidi"/>
+                </w:rPr>
+                <m:t>H</m:t>
+              </m:r>
+            </m:e>
+            <m:sub>
+              <m:r>
+                <w:rPr>
+                  <w:rFonts w:ascii="Cambria Math" w:hAnsi="Cambria Math" w:cstheme="majorBidi"/>
+                </w:rPr>
+                <m:t>0</m:t>
+              </m:r>
+            </m:sub>
+          </m:sSub>
+          <m:r>
+            <w:rPr>
+              <w:rFonts w:ascii="Cambria Math" w:hAnsi="Cambria Math" w:cstheme="majorBidi"/>
+            </w:rPr>
+            <m:t>:</m:t>
+          </m:r>
+          <m:sSub>
+            <m:sSubPr>
+              <m:ctrlPr>
+                <w:rPr>
+                  <w:rFonts w:ascii="Cambria Math" w:hAnsi="Cambria Math" w:cstheme="majorBidi"/>
+                </w:rPr>
+              </m:ctrlPr>
+            </m:sSubPr>
+            <m:e>
+              <m:r>
+                <w:rPr>
+                  <w:rFonts w:ascii="Cambria Math" w:hAnsi="Cambria Math" w:cstheme="majorBidi"/>
+                </w:rPr>
+                <m:t>β</m:t>
+              </m:r>
+            </m:e>
+            <m:sub>
+              <m:r>
+                <w:rPr>
+                  <w:rFonts w:ascii="Cambria Math" w:hAnsi="Cambria Math" w:cstheme="majorBidi"/>
+                </w:rPr>
+                <m:t>1</m:t>
+              </m:r>
+            </m:sub>
+          </m:sSub>
+          <m:r>
+            <w:rPr>
+              <w:rFonts w:ascii="Cambria Math" w:hAnsi="Cambria Math" w:cstheme="majorBidi"/>
+            </w:rPr>
+            <m:t>=</m:t>
+          </m:r>
+          <m:sSub>
+            <m:sSubPr>
+              <m:ctrlPr>
+                <w:rPr>
+                  <w:rFonts w:ascii="Cambria Math" w:hAnsi="Cambria Math" w:cstheme="majorBidi"/>
+                </w:rPr>
+              </m:ctrlPr>
+            </m:sSubPr>
+            <m:e>
+              <m:r>
+                <w:rPr>
+                  <w:rFonts w:ascii="Cambria Math" w:hAnsi="Cambria Math" w:cstheme="majorBidi"/>
+                </w:rPr>
+                <m:t>β</m:t>
+              </m:r>
+            </m:e>
+            <m:sub>
+              <m:r>
+                <w:rPr>
+                  <w:rFonts w:ascii="Cambria Math" w:hAnsi="Cambria Math" w:cstheme="majorBidi"/>
+                </w:rPr>
+                <m:t>2</m:t>
+              </m:r>
+            </m:sub>
+          </m:sSub>
+          <m:r>
+            <w:rPr>
+              <w:rFonts w:ascii="Cambria Math" w:hAnsi="Cambria Math" w:cstheme="majorBidi"/>
+            </w:rPr>
+            <m:t>=</m:t>
+          </m:r>
+          <m:sSub>
+            <m:sSubPr>
+              <m:ctrlPr>
+                <w:rPr>
+                  <w:rFonts w:ascii="Cambria Math" w:hAnsi="Cambria Math" w:cstheme="majorBidi"/>
+                </w:rPr>
+              </m:ctrlPr>
+            </m:sSubPr>
+            <m:e>
+              <m:r>
+                <w:rPr>
+                  <w:rFonts w:ascii="Cambria Math" w:hAnsi="Cambria Math" w:cstheme="majorBidi"/>
+                </w:rPr>
+                <m:t>β</m:t>
+              </m:r>
+            </m:e>
+            <m:sub>
+              <m:r>
+                <w:rPr>
+                  <w:rFonts w:ascii="Cambria Math" w:hAnsi="Cambria Math" w:cstheme="majorBidi"/>
+                </w:rPr>
+                <m:t>3</m:t>
+              </m:r>
+            </m:sub>
+          </m:sSub>
+          <m:r>
+            <w:rPr>
+              <w:rFonts w:ascii="Cambria Math" w:hAnsi="Cambria Math" w:cstheme="majorBidi"/>
+            </w:rPr>
+            <m:t>=</m:t>
+          </m:r>
+          <m:sSub>
+            <m:sSubPr>
+              <m:ctrlPr>
+                <w:rPr>
+                  <w:rFonts w:ascii="Cambria Math" w:hAnsi="Cambria Math" w:cstheme="majorBidi"/>
+                </w:rPr>
+              </m:ctrlPr>
+            </m:sSubPr>
+            <m:e>
+              <m:r>
+                <w:rPr>
+                  <w:rFonts w:ascii="Cambria Math" w:hAnsi="Cambria Math" w:cstheme="majorBidi"/>
+                </w:rPr>
+                <m:t>β</m:t>
+              </m:r>
+            </m:e>
+            <m:sub>
+              <m:r>
+                <w:rPr>
+                  <w:rFonts w:ascii="Cambria Math" w:hAnsi="Cambria Math" w:cstheme="majorBidi"/>
+                </w:rPr>
+                <m:t>4</m:t>
+              </m:r>
+            </m:sub>
+          </m:sSub>
+          <m:r>
+            <w:rPr>
+              <w:rFonts w:ascii="Cambria Math" w:hAnsi="Cambria Math" w:cstheme="majorBidi"/>
+            </w:rPr>
+            <m:t>=0</m:t>
+          </m:r>
+          <m:r>
+            <w:rPr>
+              <w:rFonts w:asciiTheme="majorBidi" w:hAnsiTheme="majorBidi" w:cstheme="majorBidi"/>
+              <w:i/>
+            </w:rPr>
+            <w:br/>
+          </m:r>
+        </m:oMath>
+      </m:oMathPara>
+      <w:r>
+        <w:rPr>
+          <w:rFonts w:asciiTheme="majorBidi" w:hAnsiTheme="majorBidi" w:cstheme="majorBidi"/>
+        </w:rPr>
+        <w:t>Interaction effects will be evaluated within outcome-specific families. Omnibus tests will be conducted at a two-sided α = 0.05.</w:t>
       </w:r>
     </w:p>
     <w:p>
@@ -428,7 +744,7 @@
         <w:rPr>
           <w:rFonts w:asciiTheme="majorBidi" w:hAnsiTheme="majorBidi" w:cstheme="majorBidi"/>
         </w:rPr>
-        <w:t>Significant interactions will be examined using predicted values and simple slope analyses at representative levels of the inflammatory marker.</w:t>
+        <w:t>If the omnibus interaction test is statistically significant, marker-specific interaction terms will be examined. For these follow-up tests, a Bonferroni correction will again be applied within each outcome-specific family. With four interaction terms, the per-test significance threshold will be:</w:t>
       </w:r>
     </w:p>
     <w:p>
@@ -438,11 +754,71 @@
           <w:rFonts w:asciiTheme="majorBidi" w:hAnsiTheme="majorBidi" w:cstheme="majorBidi"/>
         </w:rPr>
       </w:pPr>
-      <w:r>
-        <w:rPr>
-          <w:rFonts w:asciiTheme="majorBidi" w:hAnsiTheme="majorBidi" w:cstheme="majorBidi"/>
-        </w:rPr>
-        <w:t>Model specification, covariate adjustment, and diagnostic procedures will otherwise follow the same approach as in Aim 1. Given lower expected power for interaction effects, findings from Aim 2 will be interpreted cautiously, with emphasis on effect sizes and consistency across outcomes.</w:t>
+      <m:oMathPara>
+        <m:oMath>
+          <m:sSub>
+            <m:sSubPr>
+              <m:ctrlPr>
+                <w:rPr>
+                  <w:rFonts w:ascii="Cambria Math" w:hAnsi="Cambria Math" w:cstheme="majorBidi"/>
+                </w:rPr>
+              </m:ctrlPr>
+            </m:sSubPr>
+            <m:e>
+              <m:r>
+                <w:rPr>
+                  <w:rFonts w:ascii="Cambria Math" w:hAnsi="Cambria Math" w:cstheme="majorBidi"/>
+                </w:rPr>
+                <m:t>α</m:t>
+              </m:r>
+            </m:e>
+            <m:sub>
+              <m:r>
+                <m:rPr>
+                  <m:nor/>
+                </m:rPr>
+                <w:rPr>
+                  <w:rFonts w:asciiTheme="majorBidi" w:hAnsiTheme="majorBidi" w:cstheme="majorBidi"/>
+                </w:rPr>
+                <m:t>per test</m:t>
+              </m:r>
+            </m:sub>
+          </m:sSub>
+          <m:r>
+            <w:rPr>
+              <w:rFonts w:ascii="Cambria Math" w:hAnsi="Cambria Math" w:cstheme="majorBidi"/>
+            </w:rPr>
+            <m:t>=0.05</m:t>
+          </m:r>
+          <m:r>
+            <m:rPr>
+              <m:sty m:val="p"/>
+            </m:rPr>
+            <w:rPr>
+              <w:rFonts w:ascii="Cambria Math" w:hAnsi="Cambria Math" w:cstheme="majorBidi"/>
+            </w:rPr>
+            <m:t>/</m:t>
+          </m:r>
+          <m:r>
+            <w:rPr>
+              <w:rFonts w:ascii="Cambria Math" w:hAnsi="Cambria Math" w:cstheme="majorBidi"/>
+            </w:rPr>
+            <m:t>4=0.0125</m:t>
+          </m:r>
+          <m:r>
+            <w:rPr>
+              <w:rFonts w:asciiTheme="majorBidi" w:hAnsiTheme="majorBidi" w:cstheme="majorBidi"/>
+              <w:i/>
+            </w:rPr>
+            <w:br/>
+          </m:r>
+        </m:oMath>
+      </m:oMathPara>
+      <w:r>
+        <w:rPr>
+          <w:rFonts w:asciiTheme="majorBidi" w:hAnsiTheme="majorBidi" w:cstheme="majorBidi"/>
+        </w:rPr>
+        <w:t>Significant interactions will be explored using predicted values and simple slopes. Given the increased model complexity and typically smaller magnitude of interaction effects, results will be interpreted cautiously.</w:t>
       </w:r>
     </w:p>
     <w:p>
@@ -480,9 +856,8 @@
         <w:rPr>
           <w:rFonts w:asciiTheme="majorBidi" w:hAnsiTheme="majorBidi" w:cstheme="majorBidi"/>
         </w:rPr>
-        <w:t xml:space="preserve">were conducted in R using the </w:t>
-      </w:r>
-      <w:proofErr w:type="spellStart"/>
+        <w:t xml:space="preserve">Power analyses were conducted in R using the </w:t>
+      </w:r>
       <w:r>
         <w:rPr>
           <w:rFonts w:asciiTheme="majorBidi" w:hAnsiTheme="majorBidi" w:cstheme="majorBidi"/>
@@ -491,14 +866,12 @@
         </w:rPr>
         <w:t>powertools</w:t>
       </w:r>
-      <w:proofErr w:type="spellEnd"/>
       <w:r>
         <w:rPr>
           <w:rFonts w:asciiTheme="majorBidi" w:hAnsiTheme="majorBidi" w:cstheme="majorBidi"/>
         </w:rPr>
         <w:t xml:space="preserve"> package and the </w:t>
       </w:r>
-      <w:proofErr w:type="spellStart"/>
       <w:r>
         <w:rPr>
           <w:rFonts w:asciiTheme="majorBidi" w:hAnsiTheme="majorBidi" w:cstheme="majorBidi"/>
@@ -507,19 +880,26 @@
         </w:rPr>
         <w:t>mlrF.partial</w:t>
       </w:r>
-      <w:proofErr w:type="spellEnd"/>
-      <w:r>
-        <w:rPr>
-          <w:rFonts w:asciiTheme="majorBidi" w:hAnsiTheme="majorBidi" w:cstheme="majorBidi"/>
-        </w:rPr>
-        <w:t xml:space="preserve"> function, which approximates the partial F test for regression coefficients in multiple linear </w:t>
-      </w:r>
+      <w:r>
+        <w:rPr>
+          <w:rFonts w:asciiTheme="majorBidi" w:hAnsiTheme="majorBidi" w:cstheme="majorBidi"/>
+        </w:rPr>
+        <w:t xml:space="preserve"> function, which approximates partial F tests in multiple linear regression.</w:t>
+      </w:r>
+    </w:p>
+    <w:p>
+      <w:pPr>
+        <w:spacing w:line="480" w:lineRule="auto"/>
+        <w:rPr>
+          <w:rFonts w:asciiTheme="majorBidi" w:hAnsiTheme="majorBidi" w:cstheme="majorBidi"/>
+        </w:rPr>
+      </w:pPr>
       <w:r>
         <w:rPr>
           <w:rFonts w:asciiTheme="majorBidi" w:hAnsiTheme="majorBidi" w:cstheme="majorBidi"/>
         </w:rPr>
         <w:lastRenderedPageBreak/>
-        <w:t>regression. This approach was selected because the primary analyses involve testing the joint contribution of predictors using omnibus partial F tests.</w:t>
+        <w:t>All calculations correspond to the primary omnibus tests within each outcome family and assume a two-sided α = 0.05.</w:t>
       </w:r>
     </w:p>
     <w:p>
@@ -530,52 +910,217 @@
         </w:rPr>
       </w:pPr>
       <w:r>
-        <w:rPr>
-          <w:rFonts w:asciiTheme="majorBidi" w:hAnsiTheme="majorBidi" w:cstheme="majorBidi"/>
-        </w:rPr>
-        <w:t>Correlation assumptions were estimated directly from the preliminary dataset. Preliminary data suggested small-to-moderate associations between inflammatory markers and memory change and moderate-to-strong associations with cortical thickness change. Conservative assumptions for partial correlations were used given additional covariate adjustment. All calculations assumed a two-sided α = 0.05 for the primary omnibus tests.</w:t>
-      </w:r>
-    </w:p>
-    <w:p>
-      <w:pPr>
-        <w:spacing w:line="480" w:lineRule="auto"/>
         <w:rPr>
           <w:rFonts w:asciiTheme="majorBidi" w:hAnsiTheme="majorBidi" w:cstheme="majorBidi"/>
           <w:b/>
           <w:bCs/>
         </w:rPr>
-      </w:pPr>
+        <w:t>Aim 1</w:t>
+      </w:r>
       <w:r>
         <w:rPr>
           <w:rFonts w:asciiTheme="majorBidi" w:hAnsiTheme="majorBidi" w:cstheme="majorBidi"/>
           <w:b/>
           <w:bCs/>
         </w:rPr>
-        <w:t>Aim 1</w:t>
-      </w:r>
+        <w:t xml:space="preserve">: </w:t>
+      </w:r>
+      <w:r>
+        <w:rPr>
+          <w:rFonts w:asciiTheme="majorBidi" w:hAnsiTheme="majorBidi" w:cstheme="majorBidi"/>
+        </w:rPr>
+        <w:t>Power calculations correspond to testing the joint contribution of four inflammatory markers (</w:t>
+      </w:r>
+      <m:oMath>
+        <m:r>
+          <w:rPr>
+            <w:rFonts w:ascii="Cambria Math" w:hAnsi="Cambria Math" w:cstheme="majorBidi"/>
+          </w:rPr>
+          <m:t>q=4</m:t>
+        </m:r>
+      </m:oMath>
+      <w:r>
+        <w:rPr>
+          <w:rFonts w:asciiTheme="majorBidi" w:hAnsiTheme="majorBidi" w:cstheme="majorBidi"/>
+        </w:rPr>
+        <w:t>) in a model with approximately 10 predictors (</w:t>
+      </w:r>
+      <m:oMath>
+        <m:r>
+          <w:rPr>
+            <w:rFonts w:ascii="Cambria Math" w:hAnsi="Cambria Math" w:cstheme="majorBidi"/>
+            <w:highlight w:val="yellow"/>
+          </w:rPr>
+          <m:t>p=10</m:t>
+        </m:r>
+      </m:oMath>
+      <w:r>
+        <w:rPr>
+          <w:rFonts w:asciiTheme="majorBidi" w:hAnsiTheme="majorBidi" w:cstheme="majorBidi"/>
+        </w:rPr>
+        <w:t xml:space="preserve">) and sample size </w:t>
+      </w:r>
+      <m:oMath>
+        <m:r>
+          <w:rPr>
+            <w:rFonts w:ascii="Cambria Math" w:hAnsi="Cambria Math" w:cstheme="majorBidi"/>
+          </w:rPr>
+          <m:t>N=175</m:t>
+        </m:r>
+      </m:oMath>
+      <w:r>
+        <w:rPr>
+          <w:rFonts w:asciiTheme="majorBidi" w:hAnsiTheme="majorBidi" w:cstheme="majorBidi"/>
+        </w:rPr>
+        <w:t>.</w:t>
+      </w:r>
+      <w:r>
+        <w:rPr>
+          <w:rFonts w:asciiTheme="majorBidi" w:hAnsiTheme="majorBidi" w:cstheme="majorBidi"/>
+        </w:rPr>
+        <w:t xml:space="preserve"> </w:t>
+      </w:r>
+      <w:r>
+        <w:rPr>
+          <w:rFonts w:asciiTheme="majorBidi" w:hAnsiTheme="majorBidi" w:cstheme="majorBidi"/>
+        </w:rPr>
+        <w:t>Based on preliminary data and conservative assumptions:</w:t>
+      </w:r>
+    </w:p>
+    <w:p>
+      <w:pPr>
+        <w:numPr>
+          <w:ilvl w:val="0"/>
+          <w:numId w:val="2"/>
+        </w:numPr>
+        <w:spacing w:line="480" w:lineRule="auto"/>
+        <w:rPr>
+          <w:rFonts w:asciiTheme="majorBidi" w:hAnsiTheme="majorBidi" w:cstheme="majorBidi"/>
+        </w:rPr>
+      </w:pPr>
+      <w:r>
+        <w:rPr>
+          <w:rFonts w:asciiTheme="majorBidi" w:hAnsiTheme="majorBidi" w:cstheme="majorBidi"/>
+        </w:rPr>
+        <w:t xml:space="preserve">Memory: partial correlations = 0.15, 0.20, 0.25 </w:t>
+      </w:r>
+    </w:p>
+    <w:p>
+      <w:pPr>
+        <w:numPr>
+          <w:ilvl w:val="0"/>
+          <w:numId w:val="2"/>
+        </w:numPr>
+        <w:spacing w:line="480" w:lineRule="auto"/>
+        <w:rPr>
+          <w:rFonts w:asciiTheme="majorBidi" w:hAnsiTheme="majorBidi" w:cstheme="majorBidi"/>
+        </w:rPr>
+      </w:pPr>
+      <w:r>
+        <w:rPr>
+          <w:rFonts w:asciiTheme="majorBidi" w:hAnsiTheme="majorBidi" w:cstheme="majorBidi"/>
+        </w:rPr>
+        <w:t xml:space="preserve">Cortical thickness: partial correlations = 0.30, 0.40, 0.50 </w:t>
+      </w:r>
+    </w:p>
+    <w:p>
+      <w:pPr>
+        <w:spacing w:line="480" w:lineRule="auto"/>
+        <w:rPr>
+          <w:rFonts w:asciiTheme="majorBidi" w:hAnsiTheme="majorBidi" w:cstheme="majorBidi"/>
+        </w:rPr>
+      </w:pPr>
+      <w:r>
+        <w:rPr>
+          <w:rFonts w:asciiTheme="majorBidi" w:hAnsiTheme="majorBidi" w:cstheme="majorBidi"/>
+        </w:rPr>
+        <w:t>Power ranged from moderate to high, with higher power for cortical thickness outcomes reflecting stronger underlying associations.</w:t>
+      </w:r>
+    </w:p>
+    <w:p>
+      <w:pPr>
+        <w:spacing w:line="480" w:lineRule="auto"/>
+        <w:rPr>
+          <w:rFonts w:asciiTheme="majorBidi" w:hAnsiTheme="majorBidi" w:cstheme="majorBidi"/>
+        </w:rPr>
+      </w:pPr>
       <w:r>
         <w:rPr>
           <w:rFonts w:asciiTheme="majorBidi" w:hAnsiTheme="majorBidi" w:cstheme="majorBidi"/>
           <w:b/>
           <w:bCs/>
         </w:rPr>
-        <w:t xml:space="preserve">: </w:t>
-      </w:r>
-      <w:r>
-        <w:rPr>
-          <w:rFonts w:asciiTheme="majorBidi" w:hAnsiTheme="majorBidi" w:cstheme="majorBidi"/>
-        </w:rPr>
-        <w:t>Assuming a sample size of 175, 10 predictors, and partial correlations of 0.15, 0.20, and 0.25, estimated power ranged from 0.51 to 0.92. These results indicate limited power for detecting small effects but adequate power for moderate to larger associations.</w:t>
-      </w:r>
-    </w:p>
-    <w:p>
-      <w:pPr>
-        <w:spacing w:line="480" w:lineRule="auto"/>
+        <w:t>Aim 2</w:t>
+      </w:r>
+      <w:r>
         <w:rPr>
           <w:rFonts w:asciiTheme="majorBidi" w:hAnsiTheme="majorBidi" w:cstheme="majorBidi"/>
           <w:b/>
           <w:bCs/>
         </w:rPr>
+        <w:t xml:space="preserve">: </w:t>
+      </w:r>
+      <w:r>
+        <w:rPr>
+          <w:rFonts w:asciiTheme="majorBidi" w:hAnsiTheme="majorBidi" w:cstheme="majorBidi"/>
+        </w:rPr>
+        <w:t>Power calculations correspond to testing the joint contribution of four interaction terms (</w:t>
+      </w:r>
+      <m:oMath>
+        <m:r>
+          <w:rPr>
+            <w:rFonts w:ascii="Cambria Math" w:hAnsi="Cambria Math" w:cstheme="majorBidi"/>
+          </w:rPr>
+          <m:t>q=4</m:t>
+        </m:r>
+      </m:oMath>
+      <w:r>
+        <w:rPr>
+          <w:rFonts w:asciiTheme="majorBidi" w:hAnsiTheme="majorBidi" w:cstheme="majorBidi"/>
+        </w:rPr>
+        <w:t>) in a model with approximately 12 predictors (</w:t>
+      </w:r>
+      <m:oMath>
+        <m:r>
+          <w:rPr>
+            <w:rFonts w:ascii="Cambria Math" w:hAnsi="Cambria Math" w:cstheme="majorBidi"/>
+            <w:highlight w:val="yellow"/>
+          </w:rPr>
+          <m:t>p=12</m:t>
+        </m:r>
+      </m:oMath>
+      <w:r>
+        <w:rPr>
+          <w:rFonts w:asciiTheme="majorBidi" w:hAnsiTheme="majorBidi" w:cstheme="majorBidi"/>
+          <w:highlight w:val="yellow"/>
+        </w:rPr>
+        <w:t>).</w:t>
+      </w:r>
+      <w:r>
+        <w:rPr>
+          <w:rFonts w:asciiTheme="majorBidi" w:hAnsiTheme="majorBidi" w:cstheme="majorBidi"/>
+        </w:rPr>
+        <w:t xml:space="preserve"> </w:t>
+      </w:r>
+      <w:r>
+        <w:rPr>
+          <w:rFonts w:asciiTheme="majorBidi" w:hAnsiTheme="majorBidi" w:cstheme="majorBidi"/>
+        </w:rPr>
+        <w:t>Because preliminary data did not provide direct estimates of interaction effects, conservative assumed partial correlations of 0.10, 0.15, and 0.20 were used.</w:t>
+      </w:r>
+      <w:r>
+        <w:rPr>
+          <w:rFonts w:asciiTheme="majorBidi" w:hAnsiTheme="majorBidi" w:cstheme="majorBidi"/>
+        </w:rPr>
+        <w:t xml:space="preserve"> </w:t>
+      </w:r>
+    </w:p>
+    <w:p>
+      <w:pPr>
+        <w:spacing w:line="480" w:lineRule="auto"/>
+        <w:rPr>
+          <w:rFonts w:asciiTheme="majorBidi" w:hAnsiTheme="majorBidi" w:cstheme="majorBidi"/>
+        </w:rPr>
       </w:pPr>
       <w:r>
         <w:rPr>
@@ -583,7 +1128,7 @@
           <w:b/>
           <w:bCs/>
         </w:rPr>
-        <w:t>Aim 2</w:t>
+        <w:t>Type I Error</w:t>
       </w:r>
       <w:r>
         <w:rPr>
@@ -597,7 +1142,7 @@
         <w:rPr>
           <w:rFonts w:asciiTheme="majorBidi" w:hAnsiTheme="majorBidi" w:cstheme="majorBidi"/>
         </w:rPr>
-        <w:t>Assuming a sample size of 175, 12 predictors, and partial correlations of 0.10, 0.15, and 0.20 for interaction terms, estimated power ranged from 0.26 to 0.77. As expected, power to detect interaction effects is lower and adequate primarily for moderate-to-large effects.</w:t>
+        <w:t>To address multiple testing, analyses will be organized into prespecified families defined by aim and outcome.</w:t>
       </w:r>
     </w:p>
     <w:p>
@@ -608,134 +1153,172 @@
         </w:rPr>
       </w:pPr>
       <w:r>
+        <w:rPr>
+          <w:rFonts w:asciiTheme="majorBidi" w:hAnsiTheme="majorBidi" w:cstheme="majorBidi"/>
+        </w:rPr>
+        <w:t>Within each outcome-specific family, an omnibus partial F test will be conducted at α = 0.05 to evaluate the collective contribution of predictors of interest. This reduces the number of primary tests and limits inflation of Type I error.</w:t>
+      </w:r>
+    </w:p>
+    <w:p>
+      <w:pPr>
+        <w:spacing w:line="480" w:lineRule="auto"/>
+        <w:rPr>
+          <w:rFonts w:asciiTheme="majorBidi" w:hAnsiTheme="majorBidi" w:cstheme="majorBidi"/>
+        </w:rPr>
+      </w:pPr>
+      <w:r>
+        <w:rPr>
+          <w:rFonts w:asciiTheme="majorBidi" w:hAnsiTheme="majorBidi" w:cstheme="majorBidi"/>
+        </w:rPr>
+        <w:t xml:space="preserve">Only if the omnibus test is statistically significant will follow-up tests of individual coefficients be conducted. For these follow-up tests, a Bonferroni correction will be applied within each </w:t>
+      </w:r>
+      <w:r>
+        <w:rPr>
+          <w:rFonts w:asciiTheme="majorBidi" w:hAnsiTheme="majorBidi" w:cstheme="majorBidi"/>
+        </w:rPr>
+        <w:lastRenderedPageBreak/>
+        <w:t>family by dividing α by the number of tests (m = 4), yielding a per-test significance threshold of α = 0.0125.</w:t>
+      </w:r>
+    </w:p>
+    <w:p>
+      <w:pPr>
+        <w:spacing w:line="480" w:lineRule="auto"/>
+        <w:rPr>
+          <w:rFonts w:asciiTheme="majorBidi" w:hAnsiTheme="majorBidi" w:cstheme="majorBidi"/>
+        </w:rPr>
+      </w:pPr>
+      <w:r>
+        <w:rPr>
+          <w:rFonts w:asciiTheme="majorBidi" w:hAnsiTheme="majorBidi" w:cstheme="majorBidi"/>
+        </w:rPr>
+        <w:t>This two-stage approach (omnibus test followed by Bonferroni-adjusted comparisons) controls Type I error within each outcome while avoiding unnecessary multiple testing.</w:t>
+      </w:r>
+    </w:p>
+    <w:p>
+      <w:pPr>
+        <w:spacing w:line="480" w:lineRule="auto"/>
+        <w:rPr>
+          <w:rFonts w:asciiTheme="majorBidi" w:hAnsiTheme="majorBidi" w:cstheme="majorBidi"/>
+        </w:rPr>
+      </w:pPr>
+      <w:r>
+        <w:rPr>
+          <w:rFonts w:asciiTheme="majorBidi" w:hAnsiTheme="majorBidi" w:cstheme="majorBidi"/>
+        </w:rPr>
+        <w:t>Exploratory analyses will be clearly labeled and interpreted cautiously. In addition to p-values, interpretation will emphasize effect sizes, confidence intervals, and consistency of findings across outcomes and markers.</w:t>
+      </w:r>
+    </w:p>
+    <w:p>
+      <w:pPr>
+        <w:spacing w:line="480" w:lineRule="auto"/>
+        <w:rPr>
+          <w:rFonts w:asciiTheme="majorBidi" w:hAnsiTheme="majorBidi" w:cstheme="majorBidi"/>
+        </w:rPr>
+      </w:pPr>
+    </w:p>
+    <w:p>
+      <w:pPr>
+        <w:spacing w:line="480" w:lineRule="auto"/>
+        <w:rPr>
+          <w:rFonts w:asciiTheme="majorBidi" w:hAnsiTheme="majorBidi" w:cstheme="majorBidi"/>
+        </w:rPr>
+      </w:pPr>
+    </w:p>
+    <w:p>
+      <w:pPr>
+        <w:spacing w:line="480" w:lineRule="auto"/>
+        <w:rPr>
+          <w:rFonts w:asciiTheme="majorBidi" w:hAnsiTheme="majorBidi" w:cstheme="majorBidi"/>
+        </w:rPr>
+      </w:pPr>
+    </w:p>
+    <w:p>
+      <w:pPr>
+        <w:spacing w:line="480" w:lineRule="auto"/>
+        <w:rPr>
+          <w:rFonts w:asciiTheme="majorBidi" w:hAnsiTheme="majorBidi" w:cstheme="majorBidi"/>
+        </w:rPr>
+      </w:pPr>
+    </w:p>
+    <w:p>
+      <w:pPr>
+        <w:spacing w:line="480" w:lineRule="auto"/>
+        <w:rPr>
+          <w:rFonts w:asciiTheme="majorBidi" w:hAnsiTheme="majorBidi" w:cstheme="majorBidi"/>
+        </w:rPr>
+      </w:pPr>
+    </w:p>
+    <w:p>
+      <w:pPr>
+        <w:spacing w:line="480" w:lineRule="auto"/>
+        <w:rPr>
+          <w:rFonts w:asciiTheme="majorBidi" w:hAnsiTheme="majorBidi" w:cstheme="majorBidi"/>
+        </w:rPr>
+      </w:pPr>
+    </w:p>
+    <w:p>
+      <w:pPr>
+        <w:spacing w:line="480" w:lineRule="auto"/>
+        <w:rPr>
+          <w:rFonts w:asciiTheme="majorBidi" w:hAnsiTheme="majorBidi" w:cstheme="majorBidi"/>
+        </w:rPr>
+      </w:pPr>
+    </w:p>
+    <w:p>
+      <w:pPr>
+        <w:spacing w:line="480" w:lineRule="auto"/>
+        <w:rPr>
+          <w:rFonts w:asciiTheme="majorBidi" w:hAnsiTheme="majorBidi" w:cstheme="majorBidi"/>
+        </w:rPr>
+      </w:pPr>
+    </w:p>
+    <w:p>
+      <w:pPr>
+        <w:spacing w:line="480" w:lineRule="auto"/>
+        <w:rPr>
+          <w:rFonts w:asciiTheme="majorBidi" w:hAnsiTheme="majorBidi" w:cstheme="majorBidi"/>
+        </w:rPr>
+      </w:pPr>
+    </w:p>
+    <w:p>
+      <w:pPr>
+        <w:spacing w:line="480" w:lineRule="auto"/>
+        <w:rPr>
+          <w:rFonts w:asciiTheme="majorBidi" w:hAnsiTheme="majorBidi" w:cstheme="majorBidi"/>
+        </w:rPr>
+      </w:pPr>
+    </w:p>
+    <w:p>
+      <w:pPr>
+        <w:spacing w:line="480" w:lineRule="auto"/>
+        <w:rPr>
+          <w:rFonts w:asciiTheme="majorBidi" w:hAnsiTheme="majorBidi" w:cstheme="majorBidi"/>
+        </w:rPr>
+      </w:pPr>
+    </w:p>
+    <w:p>
+      <w:pPr>
+        <w:spacing w:line="480" w:lineRule="auto"/>
+        <w:rPr>
+          <w:rFonts w:asciiTheme="majorBidi" w:hAnsiTheme="majorBidi" w:cstheme="majorBidi"/>
+        </w:rPr>
+      </w:pPr>
+    </w:p>
+    <w:p>
+      <w:pPr>
         <w:rPr>
           <w:rFonts w:asciiTheme="majorBidi" w:hAnsiTheme="majorBidi" w:cstheme="majorBidi"/>
           <w:b/>
           <w:bCs/>
         </w:rPr>
-        <w:t>Type I Error Control</w:t>
-      </w:r>
+      </w:pPr>
       <w:r>
         <w:rPr>
           <w:rFonts w:asciiTheme="majorBidi" w:hAnsiTheme="majorBidi" w:cstheme="majorBidi"/>
           <w:b/>
           <w:bCs/>
         </w:rPr>
-        <w:t xml:space="preserve">: </w:t>
-      </w:r>
-      <w:r>
-        <w:rPr>
-          <w:rFonts w:asciiTheme="majorBidi" w:hAnsiTheme="majorBidi" w:cstheme="majorBidi"/>
-        </w:rPr>
-        <w:t>B</w:t>
-      </w:r>
-      <w:r>
-        <w:rPr>
-          <w:rFonts w:asciiTheme="majorBidi" w:hAnsiTheme="majorBidi" w:cstheme="majorBidi"/>
-        </w:rPr>
-        <w:t>ecause multiple hypotheses will be evaluated across inflammatory markers, outcomes, and interaction terms, there is potential for inflation of Type I error. To address this, analyses will be organized into prespecified families defined by aim and outcome.</w:t>
-      </w:r>
-    </w:p>
-    <w:p>
-      <w:pPr>
-        <w:spacing w:line="480" w:lineRule="auto"/>
-        <w:rPr>
-          <w:rFonts w:asciiTheme="majorBidi" w:hAnsiTheme="majorBidi" w:cstheme="majorBidi"/>
-        </w:rPr>
-      </w:pPr>
-      <w:r>
-        <w:rPr>
-          <w:rFonts w:asciiTheme="majorBidi" w:hAnsiTheme="majorBidi" w:cstheme="majorBidi"/>
-        </w:rPr>
-        <w:t xml:space="preserve">Within each family, we will first conduct an omnibus partial F test at a two-sided α = 0.05 to evaluate the collective contribution of predictors of interest. This approach reduces the number of primary tests and limits inflation of Type I </w:t>
-      </w:r>
-      <w:proofErr w:type="gramStart"/>
-      <w:r>
-        <w:rPr>
-          <w:rFonts w:asciiTheme="majorBidi" w:hAnsiTheme="majorBidi" w:cstheme="majorBidi"/>
-        </w:rPr>
-        <w:t>error</w:t>
-      </w:r>
-      <w:proofErr w:type="gramEnd"/>
-      <w:r>
-        <w:rPr>
-          <w:rFonts w:asciiTheme="majorBidi" w:hAnsiTheme="majorBidi" w:cstheme="majorBidi"/>
-        </w:rPr>
-        <w:t>.</w:t>
-      </w:r>
-    </w:p>
-    <w:p>
-      <w:pPr>
-        <w:spacing w:line="480" w:lineRule="auto"/>
-        <w:rPr>
-          <w:rFonts w:asciiTheme="majorBidi" w:hAnsiTheme="majorBidi" w:cstheme="majorBidi"/>
-        </w:rPr>
-      </w:pPr>
-      <w:r>
-        <w:rPr>
-          <w:rFonts w:asciiTheme="majorBidi" w:hAnsiTheme="majorBidi" w:cstheme="majorBidi"/>
-        </w:rPr>
-        <w:t>Only if the omnibus test is statistically significant will follow-up tests of individual markers be conducted. For these follow-up tests, a Bonferroni correction will be applied within each family to provide conservative control of Type I error.</w:t>
-      </w:r>
-    </w:p>
-    <w:p>
-      <w:pPr>
-        <w:spacing w:line="480" w:lineRule="auto"/>
-        <w:rPr>
-          <w:rFonts w:asciiTheme="majorBidi" w:hAnsiTheme="majorBidi" w:cstheme="majorBidi"/>
-        </w:rPr>
-      </w:pPr>
-      <w:r>
-        <w:rPr>
-          <w:rFonts w:asciiTheme="majorBidi" w:hAnsiTheme="majorBidi" w:cstheme="majorBidi"/>
-        </w:rPr>
         <w:lastRenderedPageBreak/>
-        <w:t>Analyses involving additional cytokines and exploratory markers will be explicitly labeled as exploratory and interpreted cautiously.</w:t>
-      </w:r>
-    </w:p>
-    <w:p>
-      <w:pPr>
-        <w:spacing w:line="480" w:lineRule="auto"/>
-        <w:rPr>
-          <w:rFonts w:asciiTheme="majorBidi" w:hAnsiTheme="majorBidi" w:cstheme="majorBidi"/>
-        </w:rPr>
-      </w:pPr>
-      <w:r>
-        <w:rPr>
-          <w:rFonts w:asciiTheme="majorBidi" w:hAnsiTheme="majorBidi" w:cstheme="majorBidi"/>
-        </w:rPr>
-        <w:t>In addition to p-values, interpretation will emphasize effect sizes, confidence intervals, and consistency of findings across related outcomes and markers.</w:t>
-      </w:r>
-    </w:p>
-    <w:p>
-      <w:pPr>
-        <w:spacing w:line="480" w:lineRule="auto"/>
-        <w:rPr>
-          <w:rFonts w:asciiTheme="majorBidi" w:hAnsiTheme="majorBidi" w:cstheme="majorBidi"/>
-        </w:rPr>
-      </w:pPr>
-    </w:p>
-    <w:p>
-      <w:pPr>
-        <w:rPr>
-          <w:rFonts w:asciiTheme="majorBidi" w:hAnsiTheme="majorBidi" w:cstheme="majorBidi"/>
-        </w:rPr>
-      </w:pPr>
-    </w:p>
-    <w:p>
-      <w:pPr>
-        <w:rPr>
-          <w:rFonts w:asciiTheme="majorBidi" w:hAnsiTheme="majorBidi" w:cstheme="majorBidi"/>
-          <w:b/>
-          <w:bCs/>
-        </w:rPr>
-      </w:pPr>
-      <w:r>
-        <w:rPr>
-          <w:rFonts w:asciiTheme="majorBidi" w:hAnsiTheme="majorBidi" w:cstheme="majorBidi"/>
-          <w:b/>
-          <w:bCs/>
-        </w:rPr>
         <w:t>Table</w:t>
       </w:r>
       <w:r>
@@ -1154,30 +1737,8 @@
               <w:rPr>
                 <w:rFonts w:asciiTheme="majorBidi" w:hAnsiTheme="majorBidi" w:cstheme="majorBidi"/>
               </w:rPr>
-              <w:t xml:space="preserve">Beta-2 </w:t>
-            </w:r>
-            <w:proofErr w:type="spellStart"/>
-            <w:r>
-              <w:rPr>
-                <w:rFonts w:asciiTheme="majorBidi" w:hAnsiTheme="majorBidi" w:cstheme="majorBidi"/>
-              </w:rPr>
-              <w:t>microglobulin</w:t>
-            </w:r>
-            <w:proofErr w:type="spellEnd"/>
-            <w:r>
-              <w:rPr>
-                <w:rFonts w:asciiTheme="majorBidi" w:hAnsiTheme="majorBidi" w:cstheme="majorBidi"/>
-              </w:rPr>
-              <w:t xml:space="preserve">, Alpha-1 </w:t>
-            </w:r>
-            <w:proofErr w:type="spellStart"/>
-            <w:r>
-              <w:rPr>
-                <w:rFonts w:asciiTheme="majorBidi" w:hAnsiTheme="majorBidi" w:cstheme="majorBidi"/>
-              </w:rPr>
-              <w:t>antichymotrypsin</w:t>
-            </w:r>
-            <w:proofErr w:type="spellEnd"/>
+              <w:t>Beta-2 microglobulin, Alpha-1 antichymotrypsin</w:t>
+            </w:r>
           </w:p>
         </w:tc>
         <w:tc>
@@ -1901,7 +2462,7 @@
     </w:p>
     <w:p/>
     <w:sectPr>
-      <w:footerReference w:type="default" r:id="rId6"/>
+      <w:footerReference w:type="default" r:id="rId7"/>
       <w:pgSz w:w="12240" w:h="15840"/>
       <w:pgMar w:top="1440" w:right="1440" w:bottom="1440" w:left="1440" w:header="720" w:footer="720" w:gutter="0"/>
       <w:cols w:space="720"/>
@@ -2037,6 +2598,315 @@
     </w:p>
   </w:footnote>
 </w:footnotes>
+</file>
+
+<file path=word/numbering.xml><?xml version="1.0" encoding="utf-8"?>
+<w:numbering xmlns:wpc="http://schemas.microsoft.com/office/word/2010/wordprocessingCanvas" xmlns:cx="http://schemas.microsoft.com/office/drawing/2014/chartex" xmlns:cx1="http://schemas.microsoft.com/office/drawing/2015/9/8/chartex" xmlns:cx2="http://schemas.microsoft.com/office/drawing/2015/10/21/chartex" xmlns:cx3="http://schemas.microsoft.com/office/drawing/2016/5/9/chartex" xmlns:cx4="http://schemas.microsoft.com/office/drawing/2016/5/10/chartex" xmlns:cx5="http://schemas.microsoft.com/office/drawing/2016/5/11/chartex" xmlns:cx6="http://schemas.microsoft.com/office/drawing/2016/5/12/chartex" xmlns:cx7="http://schemas.microsoft.com/office/drawing/2016/5/13/chartex" xmlns:cx8="http://schemas.microsoft.com/office/drawing/2016/5/14/chartex" xmlns:mc="http://schemas.openxmlformats.org/markup-compatibility/2006" xmlns:aink="http://schemas.microsoft.com/office/drawing/2016/ink" xmlns:am3d="http://schemas.microsoft.com/office/drawing/2017/model3d" xmlns:o="urn:schemas-microsoft-com:office:office" xmlns:oel="http://schemas.microsoft.com/office/2019/extlst" xmlns:r="http://schemas.openxmlformats.org/officeDocument/2006/relationships" xmlns:m="http://schemas.openxmlformats.org/officeDocument/2006/math" xmlns:v="urn:schemas-microsoft-com:vml" xmlns:wp14="http://schemas.microsoft.com/office/word/2010/wordprocessingDrawing" xmlns:wp="http://schemas.openxmlformats.org/drawingml/2006/wordprocessingDrawing" xmlns:w10="urn:schemas-microsoft-com:office:word" xmlns:w="http://schemas.openxmlformats.org/wordprocessingml/2006/main" xmlns:w14="http://schemas.microsoft.com/office/word/2010/wordml" xmlns:w15="http://schemas.microsoft.com/office/word/2012/wordml" xmlns:w16cex="http://schemas.microsoft.com/office/word/2018/wordml/cex" xmlns:w16cid="http://schemas.microsoft.com/office/word/2016/wordml/cid" xmlns:w16="http://schemas.microsoft.com/office/word/2018/wordml" xmlns:w16du="http://schemas.microsoft.com/office/word/2023/wordml/word16du" xmlns:w16sdtdh="http://schemas.microsoft.com/office/word/2020/wordml/sdtdatahash" xmlns:w16sdtfl="http://schemas.microsoft.com/office/word/2024/wordml/sdtformatlock" xmlns:w16se="http://schemas.microsoft.com/office/word/2015/wordml/symex" xmlns:wpg="http://schemas.microsoft.com/office/word/2010/wordprocessingGroup" xmlns:wpi="http://schemas.microsoft.com/office/word/2010/wordprocessingInk" xmlns:wne="http://schemas.microsoft.com/office/word/2006/wordml" xmlns:wps="http://schemas.microsoft.com/office/word/2010/wordprocessingShape" mc:Ignorable="w14 w15 w16se w16cid w16 w16cex w16sdtdh w16sdtfl w16du wp14">
+  <w:abstractNum w:abstractNumId="0" w15:restartNumberingAfterBreak="0">
+    <w:nsid w:val="00A15900"/>
+    <w:multiLevelType w:val="multilevel"/>
+    <w:tmpl w:val="369ECB22"/>
+    <w:lvl w:ilvl="0">
+      <w:start w:val="1"/>
+      <w:numFmt w:val="bullet"/>
+      <w:lvlText w:val=""/>
+      <w:lvlJc w:val="left"/>
+      <w:pPr>
+        <w:tabs>
+          <w:tab w:val="num" w:pos="720"/>
+        </w:tabs>
+        <w:ind w:left="720" w:hanging="360"/>
+      </w:pPr>
+      <w:rPr>
+        <w:rFonts w:ascii="Symbol" w:hAnsi="Symbol" w:hint="default"/>
+        <w:sz w:val="20"/>
+      </w:rPr>
+    </w:lvl>
+    <w:lvl w:ilvl="1" w:tentative="1">
+      <w:start w:val="1"/>
+      <w:numFmt w:val="bullet"/>
+      <w:lvlText w:val="o"/>
+      <w:lvlJc w:val="left"/>
+      <w:pPr>
+        <w:tabs>
+          <w:tab w:val="num" w:pos="1440"/>
+        </w:tabs>
+        <w:ind w:left="1440" w:hanging="360"/>
+      </w:pPr>
+      <w:rPr>
+        <w:rFonts w:ascii="Courier New" w:hAnsi="Courier New" w:hint="default"/>
+        <w:sz w:val="20"/>
+      </w:rPr>
+    </w:lvl>
+    <w:lvl w:ilvl="2" w:tentative="1">
+      <w:start w:val="1"/>
+      <w:numFmt w:val="bullet"/>
+      <w:lvlText w:val=""/>
+      <w:lvlJc w:val="left"/>
+      <w:pPr>
+        <w:tabs>
+          <w:tab w:val="num" w:pos="2160"/>
+        </w:tabs>
+        <w:ind w:left="2160" w:hanging="360"/>
+      </w:pPr>
+      <w:rPr>
+        <w:rFonts w:ascii="Wingdings" w:hAnsi="Wingdings" w:hint="default"/>
+        <w:sz w:val="20"/>
+      </w:rPr>
+    </w:lvl>
+    <w:lvl w:ilvl="3" w:tentative="1">
+      <w:start w:val="1"/>
+      <w:numFmt w:val="bullet"/>
+      <w:lvlText w:val=""/>
+      <w:lvlJc w:val="left"/>
+      <w:pPr>
+        <w:tabs>
+          <w:tab w:val="num" w:pos="2880"/>
+        </w:tabs>
+        <w:ind w:left="2880" w:hanging="360"/>
+      </w:pPr>
+      <w:rPr>
+        <w:rFonts w:ascii="Wingdings" w:hAnsi="Wingdings" w:hint="default"/>
+        <w:sz w:val="20"/>
+      </w:rPr>
+    </w:lvl>
+    <w:lvl w:ilvl="4" w:tentative="1">
+      <w:start w:val="1"/>
+      <w:numFmt w:val="bullet"/>
+      <w:lvlText w:val=""/>
+      <w:lvlJc w:val="left"/>
+      <w:pPr>
+        <w:tabs>
+          <w:tab w:val="num" w:pos="3600"/>
+        </w:tabs>
+        <w:ind w:left="3600" w:hanging="360"/>
+      </w:pPr>
+      <w:rPr>
+        <w:rFonts w:ascii="Wingdings" w:hAnsi="Wingdings" w:hint="default"/>
+        <w:sz w:val="20"/>
+      </w:rPr>
+    </w:lvl>
+    <w:lvl w:ilvl="5" w:tentative="1">
+      <w:start w:val="1"/>
+      <w:numFmt w:val="bullet"/>
+      <w:lvlText w:val=""/>
+      <w:lvlJc w:val="left"/>
+      <w:pPr>
+        <w:tabs>
+          <w:tab w:val="num" w:pos="4320"/>
+        </w:tabs>
+        <w:ind w:left="4320" w:hanging="360"/>
+      </w:pPr>
+      <w:rPr>
+        <w:rFonts w:ascii="Wingdings" w:hAnsi="Wingdings" w:hint="default"/>
+        <w:sz w:val="20"/>
+      </w:rPr>
+    </w:lvl>
+    <w:lvl w:ilvl="6" w:tentative="1">
+      <w:start w:val="1"/>
+      <w:numFmt w:val="bullet"/>
+      <w:lvlText w:val=""/>
+      <w:lvlJc w:val="left"/>
+      <w:pPr>
+        <w:tabs>
+          <w:tab w:val="num" w:pos="5040"/>
+        </w:tabs>
+        <w:ind w:left="5040" w:hanging="360"/>
+      </w:pPr>
+      <w:rPr>
+        <w:rFonts w:ascii="Wingdings" w:hAnsi="Wingdings" w:hint="default"/>
+        <w:sz w:val="20"/>
+      </w:rPr>
+    </w:lvl>
+    <w:lvl w:ilvl="7" w:tentative="1">
+      <w:start w:val="1"/>
+      <w:numFmt w:val="bullet"/>
+      <w:lvlText w:val=""/>
+      <w:lvlJc w:val="left"/>
+      <w:pPr>
+        <w:tabs>
+          <w:tab w:val="num" w:pos="5760"/>
+        </w:tabs>
+        <w:ind w:left="5760" w:hanging="360"/>
+      </w:pPr>
+      <w:rPr>
+        <w:rFonts w:ascii="Wingdings" w:hAnsi="Wingdings" w:hint="default"/>
+        <w:sz w:val="20"/>
+      </w:rPr>
+    </w:lvl>
+    <w:lvl w:ilvl="8" w:tentative="1">
+      <w:start w:val="1"/>
+      <w:numFmt w:val="bullet"/>
+      <w:lvlText w:val=""/>
+      <w:lvlJc w:val="left"/>
+      <w:pPr>
+        <w:tabs>
+          <w:tab w:val="num" w:pos="6480"/>
+        </w:tabs>
+        <w:ind w:left="6480" w:hanging="360"/>
+      </w:pPr>
+      <w:rPr>
+        <w:rFonts w:ascii="Wingdings" w:hAnsi="Wingdings" w:hint="default"/>
+        <w:sz w:val="20"/>
+      </w:rPr>
+    </w:lvl>
+  </w:abstractNum>
+  <w:abstractNum w:abstractNumId="1" w15:restartNumberingAfterBreak="0">
+    <w:nsid w:val="20546F7B"/>
+    <w:multiLevelType w:val="multilevel"/>
+    <w:tmpl w:val="1B969180"/>
+    <w:lvl w:ilvl="0">
+      <w:start w:val="1"/>
+      <w:numFmt w:val="bullet"/>
+      <w:lvlText w:val=""/>
+      <w:lvlJc w:val="left"/>
+      <w:pPr>
+        <w:tabs>
+          <w:tab w:val="num" w:pos="720"/>
+        </w:tabs>
+        <w:ind w:left="720" w:hanging="360"/>
+      </w:pPr>
+      <w:rPr>
+        <w:rFonts w:ascii="Symbol" w:hAnsi="Symbol" w:hint="default"/>
+        <w:sz w:val="20"/>
+      </w:rPr>
+    </w:lvl>
+    <w:lvl w:ilvl="1" w:tentative="1">
+      <w:start w:val="1"/>
+      <w:numFmt w:val="bullet"/>
+      <w:lvlText w:val="o"/>
+      <w:lvlJc w:val="left"/>
+      <w:pPr>
+        <w:tabs>
+          <w:tab w:val="num" w:pos="1440"/>
+        </w:tabs>
+        <w:ind w:left="1440" w:hanging="360"/>
+      </w:pPr>
+      <w:rPr>
+        <w:rFonts w:ascii="Courier New" w:hAnsi="Courier New" w:hint="default"/>
+        <w:sz w:val="20"/>
+      </w:rPr>
+    </w:lvl>
+    <w:lvl w:ilvl="2" w:tentative="1">
+      <w:start w:val="1"/>
+      <w:numFmt w:val="bullet"/>
+      <w:lvlText w:val=""/>
+      <w:lvlJc w:val="left"/>
+      <w:pPr>
+        <w:tabs>
+          <w:tab w:val="num" w:pos="2160"/>
+        </w:tabs>
+        <w:ind w:left="2160" w:hanging="360"/>
+      </w:pPr>
+      <w:rPr>
+        <w:rFonts w:ascii="Wingdings" w:hAnsi="Wingdings" w:hint="default"/>
+        <w:sz w:val="20"/>
+      </w:rPr>
+    </w:lvl>
+    <w:lvl w:ilvl="3" w:tentative="1">
+      <w:start w:val="1"/>
+      <w:numFmt w:val="bullet"/>
+      <w:lvlText w:val=""/>
+      <w:lvlJc w:val="left"/>
+      <w:pPr>
+        <w:tabs>
+          <w:tab w:val="num" w:pos="2880"/>
+        </w:tabs>
+        <w:ind w:left="2880" w:hanging="360"/>
+      </w:pPr>
+      <w:rPr>
+        <w:rFonts w:ascii="Wingdings" w:hAnsi="Wingdings" w:hint="default"/>
+        <w:sz w:val="20"/>
+      </w:rPr>
+    </w:lvl>
+    <w:lvl w:ilvl="4" w:tentative="1">
+      <w:start w:val="1"/>
+      <w:numFmt w:val="bullet"/>
+      <w:lvlText w:val=""/>
+      <w:lvlJc w:val="left"/>
+      <w:pPr>
+        <w:tabs>
+          <w:tab w:val="num" w:pos="3600"/>
+        </w:tabs>
+        <w:ind w:left="3600" w:hanging="360"/>
+      </w:pPr>
+      <w:rPr>
+        <w:rFonts w:ascii="Wingdings" w:hAnsi="Wingdings" w:hint="default"/>
+        <w:sz w:val="20"/>
+      </w:rPr>
+    </w:lvl>
+    <w:lvl w:ilvl="5" w:tentative="1">
+      <w:start w:val="1"/>
+      <w:numFmt w:val="bullet"/>
+      <w:lvlText w:val=""/>
+      <w:lvlJc w:val="left"/>
+      <w:pPr>
+        <w:tabs>
+          <w:tab w:val="num" w:pos="4320"/>
+        </w:tabs>
+        <w:ind w:left="4320" w:hanging="360"/>
+      </w:pPr>
+      <w:rPr>
+        <w:rFonts w:ascii="Wingdings" w:hAnsi="Wingdings" w:hint="default"/>
+        <w:sz w:val="20"/>
+      </w:rPr>
+    </w:lvl>
+    <w:lvl w:ilvl="6" w:tentative="1">
+      <w:start w:val="1"/>
+      <w:numFmt w:val="bullet"/>
+      <w:lvlText w:val=""/>
+      <w:lvlJc w:val="left"/>
+      <w:pPr>
+        <w:tabs>
+          <w:tab w:val="num" w:pos="5040"/>
+        </w:tabs>
+        <w:ind w:left="5040" w:hanging="360"/>
+      </w:pPr>
+      <w:rPr>
+        <w:rFonts w:ascii="Wingdings" w:hAnsi="Wingdings" w:hint="default"/>
+        <w:sz w:val="20"/>
+      </w:rPr>
+    </w:lvl>
+    <w:lvl w:ilvl="7" w:tentative="1">
+      <w:start w:val="1"/>
+      <w:numFmt w:val="bullet"/>
+      <w:lvlText w:val=""/>
+      <w:lvlJc w:val="left"/>
+      <w:pPr>
+        <w:tabs>
+          <w:tab w:val="num" w:pos="5760"/>
+        </w:tabs>
+        <w:ind w:left="5760" w:hanging="360"/>
+      </w:pPr>
+      <w:rPr>
+        <w:rFonts w:ascii="Wingdings" w:hAnsi="Wingdings" w:hint="default"/>
+        <w:sz w:val="20"/>
+      </w:rPr>
+    </w:lvl>
+    <w:lvl w:ilvl="8" w:tentative="1">
+      <w:start w:val="1"/>
+      <w:numFmt w:val="bullet"/>
+      <w:lvlText w:val=""/>
+      <w:lvlJc w:val="left"/>
+      <w:pPr>
+        <w:tabs>
+          <w:tab w:val="num" w:pos="6480"/>
+        </w:tabs>
+        <w:ind w:left="6480" w:hanging="360"/>
+      </w:pPr>
+      <w:rPr>
+        <w:rFonts w:ascii="Wingdings" w:hAnsi="Wingdings" w:hint="default"/>
+        <w:sz w:val="20"/>
+      </w:rPr>
+    </w:lvl>
+  </w:abstractNum>
+  <w:num w:numId="1" w16cid:durableId="1209420330">
+    <w:abstractNumId w:val="0"/>
+  </w:num>
+  <w:num w:numId="2" w16cid:durableId="1151826361">
+    <w:abstractNumId w:val="1"/>
+  </w:num>
+</w:numbering>
 </file>
 
 <file path=word/styles.xml><?xml version="1.0" encoding="utf-8"?>

</xml_diff>

<commit_message>
update folders and codes
</commit_message>
<xml_diff>
--- a/Project2/Report/Final Report.docx
+++ b/Project2/Report/Final Report.docx
@@ -30,21 +30,7 @@
         <w:rPr>
           <w:rFonts w:asciiTheme="minorBidi" w:hAnsiTheme="minorBidi"/>
         </w:rPr>
-        <w:t xml:space="preserve">This study examines the relationship between peripheral inflammation, Alzheimer’s disease (AD) pathology, and cognitive and neurodegenerative decline over one year. Primary outcomes include episodic memory performance and AD-signature cortical thickness. Primary predictors include circulating inflammatory markers, and analyses will evaluate whether inflammation </w:t>
-      </w:r>
-      <w:proofErr w:type="gramStart"/>
-      <w:r>
-        <w:rPr>
-          <w:rFonts w:asciiTheme="minorBidi" w:hAnsiTheme="minorBidi"/>
-        </w:rPr>
-        <w:t>moderates</w:t>
-      </w:r>
-      <w:proofErr w:type="gramEnd"/>
-      <w:r>
-        <w:rPr>
-          <w:rFonts w:asciiTheme="minorBidi" w:hAnsiTheme="minorBidi"/>
-        </w:rPr>
-        <w:t xml:space="preserve"> associations between amyloid burden and these outcomes.</w:t>
+        <w:t>This study examines the relationship between peripheral inflammation, Alzheimer’s disease (AD) pathology, and cognitive and neurodegenerative decline over one year. Primary outcomes include episodic memory performance and AD-signature cortical thickness. Primary predictors include circulating inflammatory markers, and analyses will evaluate whether inflammation moderates associations between amyloid burden and these outcomes.</w:t>
       </w:r>
     </w:p>
     <w:p>
@@ -222,25 +208,7 @@
           <w:kern w:val="0"/>
           <w14:ligatures w14:val="none"/>
         </w:rPr>
-        <w:t xml:space="preserve">Amyloid burden will be modeled continuously using global SUVR values, with a validated threshold (SUVR ≥ 1.10) used to define amyloid-positive status for secondary </w:t>
-      </w:r>
-      <w:proofErr w:type="gramStart"/>
-      <w:r>
-        <w:rPr>
-          <w:rFonts w:asciiTheme="minorBidi" w:eastAsia="Times New Roman" w:hAnsiTheme="minorBidi"/>
-          <w:kern w:val="0"/>
-          <w14:ligatures w14:val="none"/>
-        </w:rPr>
-        <w:t>analyses .</w:t>
-      </w:r>
-      <w:proofErr w:type="gramEnd"/>
-      <w:r>
-        <w:rPr>
-          <w:rFonts w:asciiTheme="minorBidi" w:eastAsia="Times New Roman" w:hAnsiTheme="minorBidi"/>
-          <w:kern w:val="0"/>
-          <w14:ligatures w14:val="none"/>
-        </w:rPr>
-        <w:t xml:space="preserve"> Moderation will be evaluated using regression models including amyloid, inflammatory markers, and an amyloid × inflammation interaction term predicting change in outcomes. The interaction term represents differences in marker–outcome associations across amyloid levels. Significant interactions will be interpreted using predicted values and simple slopes. Covariate adjustment will follow Aim 1.</w:t>
+        <w:t>Amyloid burden will be modeled continuously using global SUVR values, with a validated threshold (SUVR ≥ 1.10) used to define amyloid-positive status for secondary analyses . Moderation will be evaluated using regression models including amyloid, inflammatory markers, and an amyloid × inflammation interaction term predicting change in outcomes. The interaction term represents differences in marker–outcome associations across amyloid levels. Significant interactions will be interpreted using predicted values and simple slopes. Covariate adjustment will follow Aim 1.</w:t>
       </w:r>
     </w:p>
     <w:p>
@@ -702,7 +670,6 @@
               </w:rPr>
               <w:t>(</w:t>
             </w:r>
-            <w:proofErr w:type="gramStart"/>
             <w:r>
               <w:rPr>
                 <w:rFonts w:asciiTheme="minorBidi" w:hAnsiTheme="minorBidi"/>
@@ -719,14 +686,7 @@
               <w:rPr>
                 <w:rFonts w:asciiTheme="minorBidi" w:hAnsiTheme="minorBidi"/>
               </w:rPr>
-              <w:t>APOE</w:t>
-            </w:r>
-            <w:proofErr w:type="gramEnd"/>
-            <w:r>
-              <w:rPr>
-                <w:rFonts w:asciiTheme="minorBidi" w:hAnsiTheme="minorBidi"/>
-              </w:rPr>
-              <w:t xml:space="preserve"> genotype, BMI, hypercholesterolemia, NSAID use, immune-related conditions</w:t>
+              <w:t>APOE genotype, BMI, hypercholesterolemia, NSAID use, immune-related conditions</w:t>
             </w:r>
             <w:r>
               <w:rPr>
@@ -1031,7 +991,7 @@
           <w:noProof/>
         </w:rPr>
         <w:drawing>
-          <wp:anchor distT="0" distB="0" distL="114300" distR="114300" simplePos="0" relativeHeight="251658240" behindDoc="1" locked="0" layoutInCell="1" allowOverlap="1" wp14:anchorId="0453AAE0" wp14:editId="6004ACA2">
+          <wp:anchor distT="0" distB="0" distL="114300" distR="114300" simplePos="0" relativeHeight="251658240" behindDoc="1" locked="0" layoutInCell="1" allowOverlap="1" wp14:anchorId="0453AAE0" wp14:editId="7A5E1C96">
             <wp:simplePos x="0" y="0"/>
             <wp:positionH relativeFrom="margin">
               <wp:align>right</wp:align>
@@ -1476,80 +1436,44 @@
         <w:rPr>
           <w:rFonts w:ascii="Calibri" w:hAnsi="Calibri" w:cs="Calibri"/>
         </w:rPr>
-        <w:t xml:space="preserve">preliminary </w:t>
-      </w:r>
-      <w:proofErr w:type="gramStart"/>
+        <w:t>preliminary dataset</w:t>
+      </w:r>
       <w:r>
         <w:rPr>
           <w:rFonts w:ascii="Calibri" w:hAnsi="Calibri" w:cs="Calibri"/>
         </w:rPr>
-        <w:t>dataset</w:t>
+        <w:t xml:space="preserve"> is not publicly accessible, it has not been uploaded to GitHub. The original raw data were obtained from the BIOS6624 Canvas site under the </w:t>
       </w:r>
       <w:r>
         <w:rPr>
           <w:rFonts w:ascii="Calibri" w:hAnsi="Calibri" w:cs="Calibri"/>
         </w:rPr>
-        <w:t xml:space="preserve"> is</w:t>
-      </w:r>
-      <w:proofErr w:type="gramEnd"/>
+        <w:t>Project 2 module</w:t>
+      </w:r>
       <w:r>
         <w:rPr>
           <w:rFonts w:ascii="Calibri" w:hAnsi="Calibri" w:cs="Calibri"/>
         </w:rPr>
-        <w:t xml:space="preserve"> not publicly accessible, it has not been uploaded to GitHub. The original raw data </w:t>
-      </w:r>
-      <w:proofErr w:type="gramStart"/>
+        <w:t xml:space="preserve">. </w:t>
+      </w:r>
       <w:r>
         <w:rPr>
           <w:rFonts w:ascii="Calibri" w:hAnsi="Calibri" w:cs="Calibri"/>
         </w:rPr>
-        <w:t>were</w:t>
-      </w:r>
-      <w:proofErr w:type="gramEnd"/>
+        <w:t>This dataset is</w:t>
+      </w:r>
       <w:r>
         <w:rPr>
           <w:rFonts w:ascii="Calibri" w:hAnsi="Calibri" w:cs="Calibri"/>
         </w:rPr>
-        <w:t xml:space="preserve"> obtained from the BIOS6624 Canvas site under the </w:t>
+        <w:t xml:space="preserve"> used to produce these </w:t>
       </w:r>
       <w:r>
         <w:rPr>
           <w:rFonts w:ascii="Calibri" w:hAnsi="Calibri" w:cs="Calibri"/>
         </w:rPr>
-        <w:t>Project 2 module</w:t>
-      </w:r>
-      <w:r>
-        <w:rPr>
-          <w:rFonts w:ascii="Calibri" w:hAnsi="Calibri" w:cs="Calibri"/>
-        </w:rPr>
-        <w:t xml:space="preserve">. </w:t>
-      </w:r>
-      <w:r>
-        <w:rPr>
-          <w:rFonts w:ascii="Calibri" w:hAnsi="Calibri" w:cs="Calibri"/>
-        </w:rPr>
-        <w:t>This dataset is</w:t>
-      </w:r>
-      <w:r>
-        <w:rPr>
-          <w:rFonts w:ascii="Calibri" w:hAnsi="Calibri" w:cs="Calibri"/>
-        </w:rPr>
-        <w:t xml:space="preserve"> used to produce </w:t>
-      </w:r>
-      <w:proofErr w:type="gramStart"/>
-      <w:r>
-        <w:rPr>
-          <w:rFonts w:ascii="Calibri" w:hAnsi="Calibri" w:cs="Calibri"/>
-        </w:rPr>
-        <w:t xml:space="preserve">these </w:t>
-      </w:r>
-      <w:r>
-        <w:rPr>
-          <w:rFonts w:ascii="Calibri" w:hAnsi="Calibri" w:cs="Calibri"/>
-        </w:rPr>
         <w:t>correlation</w:t>
       </w:r>
-      <w:proofErr w:type="gramEnd"/>
       <w:r>
         <w:rPr>
           <w:rFonts w:ascii="Calibri" w:hAnsi="Calibri" w:cs="Calibri"/>
@@ -1609,13 +1533,23 @@
           <w:color w:val="0B769F" w:themeColor="accent4" w:themeShade="BF"/>
         </w:rPr>
       </w:pPr>
+      <w:hyperlink r:id="rId9" w:history="1">
+        <w:r>
+          <w:rPr>
+            <w:rStyle w:val="Hyperlink"/>
+            <w:b/>
+            <w:bCs/>
+          </w:rPr>
+          <w:t>https://github.com/mojdemir/BIOS-6624-Projects/tree/main/Project2/Code</w:t>
+        </w:r>
+      </w:hyperlink>
       <w:r>
         <w:rPr>
           <w:b/>
           <w:bCs/>
           <w:color w:val="0B769F" w:themeColor="accent4" w:themeShade="BF"/>
         </w:rPr>
-        <w:t>https://github.com/mojdemir/BIOS-6624-Projects/tree/main/Project2/Code</w:t>
+        <w:t xml:space="preserve"> </w:t>
       </w:r>
     </w:p>
     <w:p>
@@ -1639,7 +1573,7 @@
       </w:pPr>
     </w:p>
     <w:sectPr>
-      <w:footerReference w:type="default" r:id="rId9"/>
+      <w:footerReference w:type="default" r:id="rId10"/>
       <w:pgSz w:w="12240" w:h="15840"/>
       <w:pgMar w:top="1440" w:right="1440" w:bottom="1440" w:left="1440" w:header="720" w:footer="720" w:gutter="0"/>
       <w:cols w:space="720"/>
@@ -3126,6 +3060,18 @@
       <w:u w:val="single"/>
     </w:rPr>
   </w:style>
+  <w:style w:type="character" w:styleId="UnresolvedMention">
+    <w:name w:val="Unresolved Mention"/>
+    <w:basedOn w:val="DefaultParagraphFont"/>
+    <w:uiPriority w:val="99"/>
+    <w:semiHidden/>
+    <w:unhideWhenUsed/>
+    <w:rsid w:val="000824CF"/>
+    <w:rPr>
+      <w:color w:val="605E5C"/>
+      <w:shd w:val="clear" w:color="auto" w:fill="E1DFDD"/>
+    </w:rPr>
+  </w:style>
 </w:styles>
 </file>
 

</xml_diff>